<commit_message>
Run 6: test the law on 63 new models; correct law constants; update paper, slides, reports
- run 6 (plan §18): frozen law tested on new (h, eps), context length 192/512,
  V 32/128, K 8/32, uniform keys and typos, and a RoPE grid; pre-registered
  verdicts and post-hoc diagnoses in §18.1
- law constants corrected to the point estimates (1.45, -0.35); 1.50/-0.33
  were bootstrap medians
- stress tests of the law on the original grid (verify/law_stress.py)
- paper, slides (new scope slide), reports and README updated
- queue: duplicate-run guard and machine-wide job cap; sync_and_push.sh
</commit_message>
<xml_diff>
--- a/paper_draft_preview.docx
+++ b/paper_draft_preview.docx
@@ -105,7 +105,7 @@
         </m:r>
       </m:oMath>
       <w:r>
-        <w:t xml:space="preserve">), so that recency is right in one regime and frequency in the other. We derive the Bayes-optimal rule, whose decision boundary depends on the gap since the old copies only logarithmically and not at all on how many old copies there were. Training 155 small transformers, we find that in pure regimes they match the Bayes rule, but when switches and typos are mixed their decisions are best described as the</w:t>
+        <w:t xml:space="preserve">), so that recency is right in one regime and frequency in the other. We derive the Bayes-optimal rule, whose decision boundary depends on the gap since the old copies only logarithmically and not at all on how many old copies there were. Training 218 small transformers, we find that in pure regimes they match the Bayes rule, but when switches and typos are mixed their decisions are best described as the</w:t>
       </w:r>
       <w:r>
         <w:t xml:space="preserve"> </w:t>
@@ -118,7 +118,10 @@
         <w:t xml:space="preserve">Bayes rule evaluated at the wrong parameters</w:t>
       </w:r>
       <w:r>
-        <w:t xml:space="preserve">: the models act as if values change 3–14</w:t>
+        <w:t xml:space="preserve"> </w:t>
+      </w:r>
+      <w:r>
+        <w:t xml:space="preserve">(for structured typos; with uniformly random typos a discounted counter fits better): the models act as if values change 3–14</w:t>
       </w:r>
       <m:oMath>
         <m:r>
@@ -160,7 +163,7 @@
           <m:t>≈</m:t>
         </m:r>
         <m:r>
-          <m:t>1.5</m:t>
+          <m:t>1.45</m:t>
         </m:r>
         <m:r>
           <m:t> </m:t>
@@ -222,7 +225,7 @@
           <m:t>−</m:t>
         </m:r>
         <m:r>
-          <m:t>0.33</m:t>
+          <m:t>0.35</m:t>
         </m:r>
         <m:r>
           <m:rPr>
@@ -301,7 +304,1004 @@
           <m:t>=</m:t>
         </m:r>
         <m:r>
-          <m:t>0.87</m:t>
+          <m:t>0</m:t>
+        </m:r>
+        <m:r>
+          <m:rPr>
+            <m:sty m:val="p"/>
+          </m:rPr>
+          <m:t>.</m:t>
+        </m:r>
+        <m:r>
+          <m:t>F</m:t>
+        </m:r>
+        <m:r>
+          <m:t>r</m:t>
+        </m:r>
+        <m:r>
+          <m:t>o</m:t>
+        </m:r>
+        <m:r>
+          <m:t>z</m:t>
+        </m:r>
+        <m:r>
+          <m:t>e</m:t>
+        </m:r>
+        <m:r>
+          <m:t>n</m:t>
+        </m:r>
+        <m:r>
+          <m:t>a</m:t>
+        </m:r>
+        <m:r>
+          <m:t>n</m:t>
+        </m:r>
+        <m:r>
+          <m:t>d</m:t>
+        </m:r>
+        <m:r>
+          <m:t>t</m:t>
+        </m:r>
+        <m:r>
+          <m:t>e</m:t>
+        </m:r>
+        <m:r>
+          <m:t>s</m:t>
+        </m:r>
+        <m:r>
+          <m:t>t</m:t>
+        </m:r>
+        <m:r>
+          <m:t>e</m:t>
+        </m:r>
+        <m:r>
+          <m:t>d</m:t>
+        </m:r>
+        <m:r>
+          <m:t>o</m:t>
+        </m:r>
+        <m:r>
+          <m:t>n</m:t>
+        </m:r>
+        <m:r>
+          <m:t>63</m:t>
+        </m:r>
+        <m:r>
+          <m:t>f</m:t>
+        </m:r>
+        <m:r>
+          <m:t>u</m:t>
+        </m:r>
+        <m:r>
+          <m:t>r</m:t>
+        </m:r>
+        <m:r>
+          <m:t>t</m:t>
+        </m:r>
+        <m:r>
+          <m:t>h</m:t>
+        </m:r>
+        <m:r>
+          <m:t>e</m:t>
+        </m:r>
+        <m:r>
+          <m:t>r</m:t>
+        </m:r>
+        <m:r>
+          <m:t>m</m:t>
+        </m:r>
+        <m:r>
+          <m:t>o</m:t>
+        </m:r>
+        <m:r>
+          <m:t>d</m:t>
+        </m:r>
+        <m:r>
+          <m:t>e</m:t>
+        </m:r>
+        <m:r>
+          <m:t>l</m:t>
+        </m:r>
+        <m:r>
+          <m:t>s</m:t>
+        </m:r>
+        <m:r>
+          <m:rPr>
+            <m:sty m:val="p"/>
+          </m:rPr>
+          <m:t>,</m:t>
+        </m:r>
+        <m:r>
+          <m:t>t</m:t>
+        </m:r>
+        <m:r>
+          <m:t>h</m:t>
+        </m:r>
+        <m:r>
+          <m:t>e</m:t>
+        </m:r>
+        <m:r>
+          <m:t>l</m:t>
+        </m:r>
+        <m:r>
+          <m:t>a</m:t>
+        </m:r>
+        <m:r>
+          <m:t>w</m:t>
+        </m:r>
+        <m:r>
+          <m:t>s</m:t>
+        </m:r>
+        <m:r>
+          <m:t>p</m:t>
+        </m:r>
+        <m:r>
+          <m:t>r</m:t>
+        </m:r>
+        <m:r>
+          <m:t>e</m:t>
+        </m:r>
+        <m:r>
+          <m:t>d</m:t>
+        </m:r>
+        <m:r>
+          <m:t>i</m:t>
+        </m:r>
+        <m:r>
+          <m:t>c</m:t>
+        </m:r>
+        <m:r>
+          <m:t>t</m:t>
+        </m:r>
+        <m:r>
+          <m:t>n</m:t>
+        </m:r>
+        <m:r>
+          <m:t>e</m:t>
+        </m:r>
+        <m:r>
+          <m:t>w</m:t>
+        </m:r>
+        <m:r>
+          <m:t>s</m:t>
+        </m:r>
+        <m:r>
+          <m:t>e</m:t>
+        </m:r>
+        <m:r>
+          <m:t>t</m:t>
+        </m:r>
+        <m:r>
+          <m:t>t</m:t>
+        </m:r>
+        <m:r>
+          <m:t>i</m:t>
+        </m:r>
+        <m:r>
+          <m:t>n</m:t>
+        </m:r>
+        <m:r>
+          <m:t>g</m:t>
+        </m:r>
+        <m:r>
+          <m:t>s</m:t>
+        </m:r>
+        <m:r>
+          <m:t>i</m:t>
+        </m:r>
+        <m:r>
+          <m:t>n</m:t>
+        </m:r>
+        <m:r>
+          <m:t>s</m:t>
+        </m:r>
+        <m:r>
+          <m:t>i</m:t>
+        </m:r>
+        <m:r>
+          <m:t>d</m:t>
+        </m:r>
+        <m:r>
+          <m:t>e</m:t>
+        </m:r>
+        <m:r>
+          <m:t>t</m:t>
+        </m:r>
+        <m:r>
+          <m:t>h</m:t>
+        </m:r>
+        <m:r>
+          <m:t>e</m:t>
+        </m:r>
+        <m:r>
+          <m:t>f</m:t>
+        </m:r>
+        <m:r>
+          <m:t>i</m:t>
+        </m:r>
+        <m:r>
+          <m:t>t</m:t>
+        </m:r>
+        <m:r>
+          <m:t>t</m:t>
+        </m:r>
+        <m:r>
+          <m:t>e</m:t>
+        </m:r>
+        <m:r>
+          <m:t>d</m:t>
+        </m:r>
+        <m:r>
+          <m:t>r</m:t>
+        </m:r>
+        <m:r>
+          <m:t>a</m:t>
+        </m:r>
+        <m:r>
+          <m:t>n</m:t>
+        </m:r>
+        <m:r>
+          <m:t>g</m:t>
+        </m:r>
+        <m:r>
+          <m:t>e</m:t>
+        </m:r>
+        <m:r>
+          <m:rPr>
+            <m:sty m:val="p"/>
+          </m:rPr>
+          <m:t>(</m:t>
+        </m:r>
+      </m:oMath>
+      <w:r>
+        <w:t xml:space="preserve">R^2 = 0.89</w:t>
+      </w:r>
+      <m:oMath>
+        <m:r>
+          <m:rPr>
+            <m:sty m:val="p"/>
+          </m:rPr>
+          <m:t>−</m:t>
+        </m:r>
+        <m:r>
+          <m:rPr>
+            <m:sty m:val="p"/>
+          </m:rPr>
+          <m:t>−</m:t>
+        </m:r>
+      </m:oMath>
+      <w:r>
+        <w:t xml:space="preserve">0.94</w:t>
+      </w:r>
+      <m:oMath>
+        <m:r>
+          <m:rPr>
+            <m:sty m:val="p"/>
+          </m:rPr>
+          <m:t>)</m:t>
+        </m:r>
+        <m:r>
+          <m:t>a</m:t>
+        </m:r>
+        <m:r>
+          <m:t>n</m:t>
+        </m:r>
+        <m:r>
+          <m:t>d</m:t>
+        </m:r>
+        <m:r>
+          <m:t>t</m:t>
+        </m:r>
+        <m:r>
+          <m:t>r</m:t>
+        </m:r>
+        <m:r>
+          <m:t>a</m:t>
+        </m:r>
+        <m:r>
+          <m:t>n</m:t>
+        </m:r>
+        <m:r>
+          <m:t>s</m:t>
+        </m:r>
+        <m:r>
+          <m:t>f</m:t>
+        </m:r>
+        <m:r>
+          <m:t>e</m:t>
+        </m:r>
+        <m:r>
+          <m:t>r</m:t>
+        </m:r>
+        <m:r>
+          <m:t>u</m:t>
+        </m:r>
+        <m:r>
+          <m:t>n</m:t>
+        </m:r>
+        <m:r>
+          <m:t>c</m:t>
+        </m:r>
+        <m:r>
+          <m:t>h</m:t>
+        </m:r>
+        <m:r>
+          <m:t>a</m:t>
+        </m:r>
+        <m:r>
+          <m:t>n</m:t>
+        </m:r>
+        <m:r>
+          <m:t>g</m:t>
+        </m:r>
+        <m:r>
+          <m:t>e</m:t>
+        </m:r>
+        <m:r>
+          <m:t>d</m:t>
+        </m:r>
+        <m:r>
+          <m:t>a</m:t>
+        </m:r>
+        <m:r>
+          <m:t>c</m:t>
+        </m:r>
+        <m:r>
+          <m:t>r</m:t>
+        </m:r>
+        <m:r>
+          <m:t>o</m:t>
+        </m:r>
+        <m:r>
+          <m:t>s</m:t>
+        </m:r>
+        <m:r>
+          <m:t>s</m:t>
+        </m:r>
+        <m:r>
+          <m:t>c</m:t>
+        </m:r>
+        <m:r>
+          <m:t>o</m:t>
+        </m:r>
+        <m:r>
+          <m:t>n</m:t>
+        </m:r>
+        <m:r>
+          <m:t>t</m:t>
+        </m:r>
+        <m:r>
+          <m:t>e</m:t>
+        </m:r>
+        <m:r>
+          <m:t>x</m:t>
+        </m:r>
+        <m:r>
+          <m:t>t</m:t>
+        </m:r>
+        <m:r>
+          <m:t>l</m:t>
+        </m:r>
+        <m:r>
+          <m:t>e</m:t>
+        </m:r>
+        <m:r>
+          <m:t>n</m:t>
+        </m:r>
+        <m:r>
+          <m:t>g</m:t>
+        </m:r>
+        <m:r>
+          <m:t>t</m:t>
+        </m:r>
+        <m:r>
+          <m:t>h</m:t>
+        </m:r>
+        <m:r>
+          <m:rPr>
+            <m:sty m:val="p"/>
+          </m:rPr>
+          <m:t>,</m:t>
+        </m:r>
+        <m:r>
+          <m:t>v</m:t>
+        </m:r>
+        <m:r>
+          <m:t>o</m:t>
+        </m:r>
+        <m:r>
+          <m:t>c</m:t>
+        </m:r>
+        <m:r>
+          <m:t>a</m:t>
+        </m:r>
+        <m:r>
+          <m:t>b</m:t>
+        </m:r>
+        <m:r>
+          <m:t>u</m:t>
+        </m:r>
+        <m:r>
+          <m:t>l</m:t>
+        </m:r>
+        <m:r>
+          <m:t>a</m:t>
+        </m:r>
+        <m:r>
+          <m:t>r</m:t>
+        </m:r>
+        <m:r>
+          <m:t>y</m:t>
+        </m:r>
+        <m:r>
+          <m:t>s</m:t>
+        </m:r>
+        <m:r>
+          <m:t>i</m:t>
+        </m:r>
+        <m:r>
+          <m:t>z</m:t>
+        </m:r>
+        <m:r>
+          <m:t>e</m:t>
+        </m:r>
+        <m:r>
+          <m:rPr>
+            <m:sty m:val="p"/>
+          </m:rPr>
+          <m:t>,</m:t>
+        </m:r>
+        <m:r>
+          <m:t>n</m:t>
+        </m:r>
+        <m:r>
+          <m:t>u</m:t>
+        </m:r>
+        <m:r>
+          <m:t>m</m:t>
+        </m:r>
+        <m:r>
+          <m:t>b</m:t>
+        </m:r>
+        <m:r>
+          <m:t>e</m:t>
+        </m:r>
+        <m:r>
+          <m:t>r</m:t>
+        </m:r>
+        <m:r>
+          <m:t>o</m:t>
+        </m:r>
+        <m:r>
+          <m:t>f</m:t>
+        </m:r>
+        <m:r>
+          <m:t>k</m:t>
+        </m:r>
+        <m:r>
+          <m:t>e</m:t>
+        </m:r>
+        <m:r>
+          <m:t>y</m:t>
+        </m:r>
+        <m:r>
+          <m:t>s</m:t>
+        </m:r>
+        <m:r>
+          <m:t>a</m:t>
+        </m:r>
+        <m:r>
+          <m:t>n</m:t>
+        </m:r>
+        <m:r>
+          <m:t>d</m:t>
+        </m:r>
+        <m:r>
+          <m:t>k</m:t>
+        </m:r>
+        <m:r>
+          <m:t>e</m:t>
+        </m:r>
+        <m:r>
+          <m:t>y</m:t>
+        </m:r>
+        <m:r>
+          <m:t>f</m:t>
+        </m:r>
+        <m:r>
+          <m:t>r</m:t>
+        </m:r>
+        <m:r>
+          <m:t>e</m:t>
+        </m:r>
+        <m:r>
+          <m:t>q</m:t>
+        </m:r>
+        <m:r>
+          <m:t>u</m:t>
+        </m:r>
+        <m:r>
+          <m:t>e</m:t>
+        </m:r>
+        <m:r>
+          <m:t>n</m:t>
+        </m:r>
+        <m:r>
+          <m:t>c</m:t>
+        </m:r>
+        <m:r>
+          <m:t>i</m:t>
+        </m:r>
+        <m:r>
+          <m:t>e</m:t>
+        </m:r>
+        <m:r>
+          <m:t>s</m:t>
+        </m:r>
+        <m:r>
+          <m:rPr>
+            <m:sty m:val="p"/>
+          </m:rPr>
+          <m:t>.</m:t>
+        </m:r>
+        <m:r>
+          <m:t>T</m:t>
+        </m:r>
+        <m:r>
+          <m:t>h</m:t>
+        </m:r>
+        <m:r>
+          <m:t>e</m:t>
+        </m:r>
+        <m:r>
+          <m:t>y</m:t>
+        </m:r>
+        <m:r>
+          <m:t>e</m:t>
+        </m:r>
+        <m:r>
+          <m:t>x</m:t>
+        </m:r>
+        <m:r>
+          <m:t>t</m:t>
+        </m:r>
+        <m:r>
+          <m:t>r</m:t>
+        </m:r>
+        <m:r>
+          <m:t>a</m:t>
+        </m:r>
+        <m:r>
+          <m:t>p</m:t>
+        </m:r>
+        <m:r>
+          <m:t>o</m:t>
+        </m:r>
+        <m:r>
+          <m:t>l</m:t>
+        </m:r>
+        <m:r>
+          <m:t>a</m:t>
+        </m:r>
+        <m:r>
+          <m:t>t</m:t>
+        </m:r>
+        <m:r>
+          <m:t>e</m:t>
+        </m:r>
+        <m:r>
+          <m:t>l</m:t>
+        </m:r>
+        <m:r>
+          <m:t>e</m:t>
+        </m:r>
+        <m:r>
+          <m:t>s</m:t>
+        </m:r>
+        <m:r>
+          <m:t>s</m:t>
+        </m:r>
+        <m:r>
+          <m:t>w</m:t>
+        </m:r>
+        <m:r>
+          <m:t>e</m:t>
+        </m:r>
+        <m:r>
+          <m:t>l</m:t>
+        </m:r>
+        <m:r>
+          <m:t>l</m:t>
+        </m:r>
+        <m:r>
+          <m:rPr>
+            <m:sty m:val="p"/>
+          </m:rPr>
+          <m:t>,</m:t>
+        </m:r>
+        <m:r>
+          <m:t>m</m:t>
+        </m:r>
+        <m:r>
+          <m:t>a</m:t>
+        </m:r>
+        <m:r>
+          <m:t>i</m:t>
+        </m:r>
+        <m:r>
+          <m:t>n</m:t>
+        </m:r>
+        <m:r>
+          <m:t>l</m:t>
+        </m:r>
+        <m:r>
+          <m:t>y</m:t>
+        </m:r>
+        <m:r>
+          <m:t>b</m:t>
+        </m:r>
+        <m:r>
+          <m:t>e</m:t>
+        </m:r>
+        <m:r>
+          <m:t>c</m:t>
+        </m:r>
+        <m:r>
+          <m:t>a</m:t>
+        </m:r>
+        <m:r>
+          <m:t>u</m:t>
+        </m:r>
+        <m:r>
+          <m:t>s</m:t>
+        </m:r>
+        <m:r>
+          <m:t>e</m:t>
+        </m:r>
+        <m:r>
+          <m:t>a</m:t>
+        </m:r>
+        <m:r>
+          <m:t>s</m:t>
+        </m:r>
+        <m:r>
+          <m:t>i</m:t>
+        </m:r>
+        <m:r>
+          <m:t>n</m:t>
+        </m:r>
+        <m:r>
+          <m:t>g</m:t>
+        </m:r>
+        <m:r>
+          <m:t>l</m:t>
+        </m:r>
+        <m:r>
+          <m:t>e</m:t>
+        </m:r>
+        <m:r>
+          <m:t>o</m:t>
+        </m:r>
+        <m:r>
+          <m:t>u</m:t>
+        </m:r>
+        <m:r>
+          <m:t>t</m:t>
+        </m:r>
+        <m:r>
+          <m:t>p</m:t>
+        </m:r>
+        <m:r>
+          <m:t>u</m:t>
+        </m:r>
+        <m:r>
+          <m:t>t</m:t>
+        </m:r>
+        <m:r>
+          <m:t>s</m:t>
+        </m:r>
+        <m:r>
+          <m:t>c</m:t>
+        </m:r>
+        <m:r>
+          <m:t>a</m:t>
+        </m:r>
+        <m:r>
+          <m:t>l</m:t>
+        </m:r>
+        <m:r>
+          <m:t>e</m:t>
+        </m:r>
+        <m:r>
+          <m:t>d</m:t>
+        </m:r>
+        <m:r>
+          <m:t>o</m:t>
+        </m:r>
+        <m:r>
+          <m:t>e</m:t>
+        </m:r>
+        <m:r>
+          <m:t>s</m:t>
+        </m:r>
+        <m:r>
+          <m:t>n</m:t>
+        </m:r>
+        <m:r>
+          <m:t>o</m:t>
+        </m:r>
+        <m:r>
+          <m:t>t</m:t>
+        </m:r>
+        <m:r>
+          <m:t>h</m:t>
+        </m:r>
+        <m:r>
+          <m:t>o</m:t>
+        </m:r>
+        <m:r>
+          <m:t>l</m:t>
+        </m:r>
+        <m:r>
+          <m:t>d</m:t>
+        </m:r>
+        <m:r>
+          <m:t>a</m:t>
+        </m:r>
+        <m:r>
+          <m:t>t</m:t>
+        </m:r>
+        <m:r>
+          <m:t>t</m:t>
+        </m:r>
+        <m:r>
+          <m:t>h</m:t>
+        </m:r>
+        <m:r>
+          <m:t>e</m:t>
+        </m:r>
+        <m:r>
+          <m:t>e</m:t>
+        </m:r>
+        <m:r>
+          <m:t>d</m:t>
+        </m:r>
+        <m:r>
+          <m:t>g</m:t>
+        </m:r>
+        <m:r>
+          <m:t>e</m:t>
+        </m:r>
+        <m:r>
+          <m:t>s</m:t>
+        </m:r>
+        <m:r>
+          <m:rPr>
+            <m:sty m:val="p"/>
+          </m:rPr>
+          <m:t>.</m:t>
+        </m:r>
+        <m:r>
+          <m:t>R</m:t>
+        </m:r>
+        <m:r>
+          <m:t>o</m:t>
+        </m:r>
+        <m:r>
+          <m:t>P</m:t>
+        </m:r>
+        <m:r>
+          <m:t>E</m:t>
+        </m:r>
+        <m:r>
+          <m:t>m</m:t>
+        </m:r>
+        <m:r>
+          <m:t>o</m:t>
+        </m:r>
+        <m:r>
+          <m:t>d</m:t>
+        </m:r>
+        <m:r>
+          <m:t>e</m:t>
+        </m:r>
+        <m:r>
+          <m:t>l</m:t>
+        </m:r>
+        <m:r>
+          <m:t>s</m:t>
+        </m:r>
+        <m:r>
+          <m:t>f</m:t>
+        </m:r>
+        <m:r>
+          <m:t>o</m:t>
+        </m:r>
+        <m:r>
+          <m:t>l</m:t>
+        </m:r>
+        <m:r>
+          <m:t>l</m:t>
+        </m:r>
+        <m:r>
+          <m:t>o</m:t>
+        </m:r>
+        <m:r>
+          <m:t>w</m:t>
+        </m:r>
+        <m:r>
+          <m:t>t</m:t>
+        </m:r>
+        <m:r>
+          <m:t>h</m:t>
+        </m:r>
+        <m:r>
+          <m:t>e</m:t>
+        </m:r>
+        <m:r>
+          <m:t>s</m:t>
+        </m:r>
+        <m:r>
+          <m:t>a</m:t>
+        </m:r>
+        <m:r>
+          <m:t>m</m:t>
+        </m:r>
+        <m:r>
+          <m:t>e</m:t>
+        </m:r>
+        <m:r>
+          <m:t>B</m:t>
+        </m:r>
+        <m:r>
+          <m:t>a</m:t>
+        </m:r>
+        <m:r>
+          <m:t>y</m:t>
+        </m:r>
+        <m:r>
+          <m:t>e</m:t>
+        </m:r>
+        <m:r>
+          <m:t>s</m:t>
+        </m:r>
+        <m:r>
+          <m:t>f</m:t>
+        </m:r>
+        <m:r>
+          <m:t>o</m:t>
+        </m:r>
+        <m:r>
+          <m:t>r</m:t>
+        </m:r>
+        <m:r>
+          <m:t>m</m:t>
+        </m:r>
+        <m:r>
+          <m:t>w</m:t>
+        </m:r>
+        <m:r>
+          <m:t>i</m:t>
+        </m:r>
+        <m:r>
+          <m:t>t</m:t>
+        </m:r>
+        <m:r>
+          <m:t>h</m:t>
+        </m:r>
+        <m:r>
+          <m:t>t</m:t>
+        </m:r>
+        <m:r>
+          <m:t>h</m:t>
+        </m:r>
+        <m:r>
+          <m:t>e</m:t>
+        </m:r>
+        <m:r>
+          <m:t>i</m:t>
+        </m:r>
+        <m:r>
+          <m:t>r</m:t>
+        </m:r>
+        <m:r>
+          <m:t>o</m:t>
+        </m:r>
+        <m:r>
+          <m:t>w</m:t>
+        </m:r>
+        <m:r>
+          <m:t>n</m:t>
+        </m:r>
+        <m:r>
+          <m:rPr>
+            <m:sty m:val="p"/>
+          </m:rPr>
+          <m:t>,</m:t>
+        </m:r>
+        <m:r>
+          <m:t>n</m:t>
+        </m:r>
+        <m:r>
+          <m:t>e</m:t>
+        </m:r>
+        <m:r>
+          <m:t>a</m:t>
+        </m:r>
+        <m:r>
+          <m:t>r</m:t>
+        </m:r>
+        <m:r>
+          <m:t>l</m:t>
+        </m:r>
+        <m:r>
+          <m:t>y</m:t>
+        </m:r>
+        <m:r>
+          <m:t>c</m:t>
+        </m:r>
+        <m:r>
+          <m:t>a</m:t>
+        </m:r>
+        <m:r>
+          <m:t>l</m:t>
+        </m:r>
+        <m:r>
+          <m:t>i</m:t>
+        </m:r>
+        <m:r>
+          <m:t>b</m:t>
+        </m:r>
+        <m:r>
+          <m:t>r</m:t>
+        </m:r>
+        <m:r>
+          <m:t>a</m:t>
+        </m:r>
+        <m:r>
+          <m:t>t</m:t>
+        </m:r>
+        <m:r>
+          <m:t>e</m:t>
+        </m:r>
+        <m:r>
+          <m:t>d</m:t>
+        </m:r>
+        <m:r>
+          <m:rPr>
+            <m:sty m:val="p"/>
+          </m:rPr>
+          <m:t>,</m:t>
+        </m:r>
+        <m:r>
+          <m:t>c</m:t>
+        </m:r>
+        <m:r>
+          <m:t>o</m:t>
+        </m:r>
+        <m:r>
+          <m:t>n</m:t>
+        </m:r>
+        <m:r>
+          <m:t>s</m:t>
+        </m:r>
+        <m:r>
+          <m:t>t</m:t>
+        </m:r>
+        <m:r>
+          <m:t>a</m:t>
+        </m:r>
+        <m:r>
+          <m:t>n</m:t>
+        </m:r>
+        <m:r>
+          <m:t>t</m:t>
+        </m:r>
+        <m:r>
+          <m:t>s</m:t>
+        </m:r>
+        <m:r>
+          <m:t>.87</m:t>
         </m:r>
       </m:oMath>
       <w:r>
@@ -703,7 +1703,7 @@
         </w:numPr>
       </w:pPr>
       <w:r>
-        <w:t xml:space="preserve">A behavioural finding: across 155 trained models, conflict decisions are described best by the Bayes rule at</w:t>
+        <w:t xml:space="preserve">A behavioural finding: across 218 trained models, conflict decisions are described best by the Bayes rule at</w:t>
       </w:r>
       <w:r>
         <w:t xml:space="preserve"> </w:t>
@@ -832,7 +1832,7 @@
         <w:t xml:space="preserve"> </w:t>
       </w:r>
       <w:r>
-        <w:t xml:space="preserve">alone (Section </w:t>
+        <w:t xml:space="preserve">alone, tested before training on 63 new models in new settings, context lengths, vocabularies, numbers of keys and positional encodings (Section </w:t>
       </w:r>
       <w:hyperlink w:anchor="sec:laws">
         <w:r>
@@ -3683,7 +4683,7 @@
         <w:t xml:space="preserve"> </w:t>
       </w:r>
       <w:r>
-        <w:t xml:space="preserve">nats. We trained 155 models: 2 gate models, 36 in four corner and mixed settings, 69 for positional-encoding controls, conflict-enriched training, a uniform-typo corner and a</w:t>
+        <w:t xml:space="preserve">nats. We trained 218 models: 2 gate models, 36 in four corner and mixed settings, 69 for positional-encoding controls, conflict-enriched training, a uniform-typo corner and a</w:t>
       </w:r>
       <w:r>
         <w:t xml:space="preserve"> </w:t>
@@ -3815,7 +4815,132 @@
         </m:r>
       </m:oMath>
       <w:r>
-        <w:t xml:space="preserve">, 16 longer or wider models, and 32 audit runs (reproducibility, learning rate, batch size). Models without positional encoding did not train within the budget.</w:t>
+        <w:t xml:space="preserve">, 16 longer or wider models, 32 audit runs (reproducibility, learning rate, batch size), and 63 runs testing the frozen laws (Section </w:t>
+      </w:r>
+      <w:hyperlink w:anchor="sec:laws">
+        <w:r>
+          <w:rPr>
+            <w:rStyle w:val="Hyperlink"/>
+          </w:rPr>
+          <w:t xml:space="preserve">4</w:t>
+        </w:r>
+      </w:hyperlink>
+      <w:r>
+        <w:t xml:space="preserve">): new</w:t>
+      </w:r>
+      <w:r>
+        <w:t xml:space="preserve"> </w:t>
+      </w:r>
+      <m:oMath>
+        <m:r>
+          <m:rPr>
+            <m:sty m:val="p"/>
+          </m:rPr>
+          <m:t>(</m:t>
+        </m:r>
+        <m:r>
+          <m:t>h</m:t>
+        </m:r>
+        <m:r>
+          <m:rPr>
+            <m:sty m:val="p"/>
+          </m:rPr>
+          <m:t>,</m:t>
+        </m:r>
+        <m:r>
+          <m:t>ε</m:t>
+        </m:r>
+        <m:r>
+          <m:rPr>
+            <m:sty m:val="p"/>
+          </m:rPr>
+          <m:t>)</m:t>
+        </m:r>
+      </m:oMath>
+      <w:r>
+        <w:t xml:space="preserve">, context lengths 192 and 512,</w:t>
+      </w:r>
+      <w:r>
+        <w:t xml:space="preserve"> </w:t>
+      </w:r>
+      <m:oMath>
+        <m:r>
+          <m:t>V</m:t>
+        </m:r>
+        <m:r>
+          <m:rPr>
+            <m:sty m:val="p"/>
+          </m:rPr>
+          <m:t>∈</m:t>
+        </m:r>
+        <m:r>
+          <m:rPr>
+            <m:sty m:val="p"/>
+          </m:rPr>
+          <m:t>{</m:t>
+        </m:r>
+        <m:r>
+          <m:t>32</m:t>
+        </m:r>
+        <m:r>
+          <m:rPr>
+            <m:sty m:val="p"/>
+          </m:rPr>
+          <m:t>,</m:t>
+        </m:r>
+        <m:r>
+          <m:t>128</m:t>
+        </m:r>
+        <m:r>
+          <m:rPr>
+            <m:sty m:val="p"/>
+          </m:rPr>
+          <m:t>}</m:t>
+        </m:r>
+      </m:oMath>
+      <w:r>
+        <w:t xml:space="preserve">,</w:t>
+      </w:r>
+      <w:r>
+        <w:t xml:space="preserve"> </w:t>
+      </w:r>
+      <m:oMath>
+        <m:r>
+          <m:t>K</m:t>
+        </m:r>
+        <m:r>
+          <m:rPr>
+            <m:sty m:val="p"/>
+          </m:rPr>
+          <m:t>∈</m:t>
+        </m:r>
+        <m:r>
+          <m:rPr>
+            <m:sty m:val="p"/>
+          </m:rPr>
+          <m:t>{</m:t>
+        </m:r>
+        <m:r>
+          <m:t>8</m:t>
+        </m:r>
+        <m:r>
+          <m:rPr>
+            <m:sty m:val="p"/>
+          </m:rPr>
+          <m:t>,</m:t>
+        </m:r>
+        <m:r>
+          <m:t>32</m:t>
+        </m:r>
+        <m:r>
+          <m:rPr>
+            <m:sty m:val="p"/>
+          </m:rPr>
+          <m:t>}</m:t>
+        </m:r>
+      </m:oMath>
+      <w:r>
+        <w:t xml:space="preserve">, uniform key frequencies and uniform typos, and RoPE on the full grid. Models without positional encoding did not train within the budget.</w:t>
       </w:r>
     </w:p>
     <w:bookmarkEnd w:id="20"/>
@@ -4917,7 +6042,7 @@
     </w:p>
     <w:bookmarkEnd w:id="37"/>
     <w:bookmarkEnd w:id="38"/>
-    <w:bookmarkStart w:id="45" w:name="sec:laws"/>
+    <w:bookmarkStart w:id="55" w:name="sec:laws"/>
     <w:p>
       <w:pPr>
         <w:pStyle w:val="Heading1"/>
@@ -5009,7 +6134,7 @@
         </w:r>
       </w:hyperlink>
       <w:r>
-        <w:t xml:space="preserve">; 95% intervals from resampling seeds):</w:t>
+        <w:t xml:space="preserve">; point estimates from the 12 setting medians, 95% intervals from resampling seeds):</w:t>
       </w:r>
     </w:p>
     <w:p>
@@ -5043,7 +6168,7 @@
             <m:t>=</m:t>
           </m:r>
           <m:r>
-            <m:t>1.50</m:t>
+            <m:t>1.45</m:t>
           </m:r>
           <m:r>
             <m:t> </m:t>
@@ -5166,7 +6291,7 @@
             <m:t>−</m:t>
           </m:r>
           <m:r>
-            <m:t>0.33</m:t>
+            <m:t>0.35</m:t>
           </m:r>
           <m:r>
             <m:t> </m:t>
@@ -5570,13 +6695,13 @@
       </w:r>
     </w:p>
     <w:bookmarkEnd w:id="43"/>
-    <w:bookmarkStart w:id="44" w:name="robustness."/>
+    <w:bookmarkStart w:id="48" w:name="stress-tests."/>
     <w:p>
       <w:pPr>
         <w:pStyle w:val="Heading4"/>
       </w:pPr>
       <w:r>
-        <w:t xml:space="preserve">Robustness.</w:t>
+        <w:t xml:space="preserve">Stress tests.</w:t>
       </w:r>
     </w:p>
     <w:p>
@@ -5584,7 +6709,190 @@
         <w:pStyle w:val="FirstParagraph"/>
       </w:pPr>
       <w:r>
-        <w:t xml:space="preserve">The qualitative pattern holds for every variation tested: retraining with the same seed reproduces</w:t>
+        <w:t xml:space="preserve">Three further checks bound how far Eq. </w:t>
+      </w:r>
+      <w:hyperlink w:anchor="eq:laws">
+        <w:r>
+          <w:rPr>
+            <w:rStyle w:val="Hyperlink"/>
+          </w:rPr>
+          <w:t xml:space="preserve">[eq:laws]</w:t>
+        </w:r>
+      </w:hyperlink>
+      <w:r>
+        <w:t xml:space="preserve"> </w:t>
+      </w:r>
+      <w:r>
+        <w:t xml:space="preserve">can be trusted.</w:t>
+      </w:r>
+    </w:p>
+    <w:p>
+      <w:pPr>
+        <w:numPr>
+          <w:ilvl w:val="0"/>
+          <w:numId w:val="1002"/>
+        </w:numPr>
+      </w:pPr>
+      <w:r>
+        <w:rPr>
+          <w:i/>
+          <w:iCs/>
+        </w:rPr>
+        <w:t xml:space="preserve">Extrapolation.</w:t>
+      </w:r>
+      <w:r>
+        <w:t xml:space="preserve"> </w:t>
+      </w:r>
+      <w:r>
+        <w:t xml:space="preserve">Holding out a whole level of</w:t>
+      </w:r>
+      <w:r>
+        <w:t xml:space="preserve"> </w:t>
+      </w:r>
+      <m:oMath>
+        <m:r>
+          <m:t>h</m:t>
+        </m:r>
+      </m:oMath>
+      <w:r>
+        <w:t xml:space="preserve"> </w:t>
+      </w:r>
+      <w:r>
+        <w:t xml:space="preserve">or</w:t>
+      </w:r>
+      <w:r>
+        <w:t xml:space="preserve"> </w:t>
+      </w:r>
+      <m:oMath>
+        <m:r>
+          <m:t>ε</m:t>
+        </m:r>
+      </m:oMath>
+      <w:r>
+        <w:t xml:space="preserve"> </w:t>
+      </w:r>
+      <w:r>
+        <w:t xml:space="preserve">and predicting it from the rest gives median</w:t>
+      </w:r>
+      <w:r>
+        <w:t xml:space="preserve"> </w:t>
+      </w:r>
+      <m:oMath>
+        <m:sSup>
+          <m:e>
+            <m:r>
+              <m:t>R</m:t>
+            </m:r>
+          </m:e>
+          <m:sup>
+            <m:r>
+              <m:t>2</m:t>
+            </m:r>
+          </m:sup>
+        </m:sSup>
+        <m:r>
+          <m:rPr>
+            <m:sty m:val="p"/>
+          </m:rPr>
+          <m:t>≥</m:t>
+        </m:r>
+        <m:r>
+          <m:t>0.78</m:t>
+        </m:r>
+      </m:oMath>
+      <w:r>
+        <w:t xml:space="preserve"> </w:t>
+      </w:r>
+      <w:r>
+        <w:t xml:space="preserve">for 6 of 7 levels. The exception is predicting</w:t>
+      </w:r>
+      <w:r>
+        <w:t xml:space="preserve"> </w:t>
+      </w:r>
+      <m:oMath>
+        <m:r>
+          <m:t>h</m:t>
+        </m:r>
+        <m:r>
+          <m:rPr>
+            <m:sty m:val="p"/>
+          </m:rPr>
+          <m:t>=</m:t>
+        </m:r>
+        <m:r>
+          <m:t>0.03</m:t>
+        </m:r>
+      </m:oMath>
+      <w:r>
+        <w:t xml:space="preserve"> </w:t>
+      </w:r>
+      <w:r>
+        <w:t xml:space="preserve">from the two lower levels, at 0.72.</w:t>
+      </w:r>
+    </w:p>
+    <w:p>
+      <w:pPr>
+        <w:numPr>
+          <w:ilvl w:val="0"/>
+          <w:numId w:val="1002"/>
+        </w:numPr>
+      </w:pPr>
+      <w:r>
+        <w:rPr>
+          <w:i/>
+          <w:iCs/>
+        </w:rPr>
+        <w:t xml:space="preserve">Noise ceiling.</w:t>
+      </w:r>
+      <w:r>
+        <w:t xml:space="preserve"> </w:t>
+      </w:r>
+      <w:r>
+        <w:t xml:space="preserve">The mean surface of the other seeds predicts a model’s surface at</w:t>
+      </w:r>
+      <w:r>
+        <w:t xml:space="preserve"> </w:t>
+      </w:r>
+      <m:oMath>
+        <m:sSup>
+          <m:e>
+            <m:r>
+              <m:t>R</m:t>
+            </m:r>
+          </m:e>
+          <m:sup>
+            <m:r>
+              <m:t>2</m:t>
+            </m:r>
+          </m:sup>
+        </m:sSup>
+        <m:r>
+          <m:rPr>
+            <m:sty m:val="p"/>
+          </m:rPr>
+          <m:t>=</m:t>
+        </m:r>
+        <m:r>
+          <m:t>0.98</m:t>
+        </m:r>
+      </m:oMath>
+      <w:r>
+        <w:t xml:space="preserve">, which bounds any description. Each model’s own fitted Bayes rule reaches 0.94, and the law reaches 0.87 on held-out settings, about 89% of the ceiling. Its sign agrees with the model’s decision on 95% of the probes that have a clear preference.</w:t>
+      </w:r>
+    </w:p>
+    <w:p>
+      <w:pPr>
+        <w:numPr>
+          <w:ilvl w:val="0"/>
+          <w:numId w:val="1002"/>
+        </w:numPr>
+      </w:pPr>
+      <w:r>
+        <w:rPr>
+          <w:i/>
+          <w:iCs/>
+        </w:rPr>
+        <w:t xml:space="preserve">Separability.</w:t>
       </w:r>
       <w:r>
         <w:t xml:space="preserve"> </w:t>
@@ -5610,7 +6918,81 @@
         <w:t xml:space="preserve"> </w:t>
       </w:r>
       <w:r>
-        <w:t xml:space="preserve">within 4% and</w:t>
+        <w:t xml:space="preserve">also depends on</w:t>
+      </w:r>
+      <w:r>
+        <w:t xml:space="preserve"> </w:t>
+      </w:r>
+      <m:oMath>
+        <m:r>
+          <m:t>ε</m:t>
+        </m:r>
+      </m:oMath>
+      <w:r>
+        <w:t xml:space="preserve">: at</w:t>
+      </w:r>
+      <w:r>
+        <w:t xml:space="preserve"> </w:t>
+      </w:r>
+      <m:oMath>
+        <m:r>
+          <m:t>h</m:t>
+        </m:r>
+        <m:r>
+          <m:rPr>
+            <m:sty m:val="p"/>
+          </m:rPr>
+          <m:t>=</m:t>
+        </m:r>
+        <m:r>
+          <m:t>0.003</m:t>
+        </m:r>
+      </m:oMath>
+      <w:r>
+        <w:t xml:space="preserve"> </w:t>
+      </w:r>
+      <w:r>
+        <w:t xml:space="preserve">it varies</w:t>
+      </w:r>
+      <w:r>
+        <w:t xml:space="preserve"> </w:t>
+      </w:r>
+      <m:oMath>
+        <m:r>
+          <m:t>3.4</m:t>
+        </m:r>
+        <m:r>
+          <m:rPr>
+            <m:sty m:val="p"/>
+          </m:rPr>
+          <m:t>×</m:t>
+        </m:r>
+      </m:oMath>
+      <w:r>
+        <w:t xml:space="preserve"> </w:t>
+      </w:r>
+      <w:r>
+        <w:t xml:space="preserve">across typo rates, and</w:t>
+      </w:r>
+      <w:r>
+        <w:t xml:space="preserve"> </w:t>
+      </w:r>
+      <m:oMath>
+        <m:r>
+          <m:t>2.9</m:t>
+        </m:r>
+        <m:r>
+          <m:rPr>
+            <m:sty m:val="p"/>
+          </m:rPr>
+          <m:t>×</m:t>
+        </m:r>
+      </m:oMath>
+      <w:r>
+        <w:t xml:space="preserve"> </w:t>
+      </w:r>
+      <w:r>
+        <w:t xml:space="preserve">when</w:t>
       </w:r>
       <w:r>
         <w:t xml:space="preserve"> </w:t>
@@ -5636,105 +7018,18 @@
         <w:t xml:space="preserve"> </w:t>
       </w:r>
       <w:r>
-        <w:t xml:space="preserve">within 2% (probe-surface correlation</w:t>
-      </w:r>
-      <w:r>
-        <w:t xml:space="preserve"> </w:t>
-      </w:r>
-      <m:oMath>
-        <m:r>
-          <m:rPr>
-            <m:sty m:val="p"/>
-          </m:rPr>
-          <m:t>≥</m:t>
-        </m:r>
-        <m:r>
-          <m:t>0.9998</m:t>
-        </m:r>
-      </m:oMath>
-      <w:r>
-        <w:t xml:space="preserve">); new seeds fall within the original range; learning rates</w:t>
-      </w:r>
-      <w:r>
-        <w:t xml:space="preserve"> </w:t>
-      </w:r>
-      <m:oMath>
-        <m:r>
-          <m:t>3</m:t>
-        </m:r>
-        <m:r>
-          <m:rPr>
-            <m:sty m:val="p"/>
-          </m:rPr>
-          <m:t>×</m:t>
-        </m:r>
-        <m:sSup>
-          <m:e>
-            <m:r>
-              <m:t>10</m:t>
-            </m:r>
-          </m:e>
-          <m:sup>
-            <m:r>
-              <m:rPr>
-                <m:sty m:val="p"/>
-              </m:rPr>
-              <m:t>−</m:t>
-            </m:r>
-            <m:r>
-              <m:t>4</m:t>
-            </m:r>
-          </m:sup>
-        </m:sSup>
-      </m:oMath>
-      <w:r>
-        <w:t xml:space="preserve"> </w:t>
-      </w:r>
-      <w:r>
-        <w:t xml:space="preserve">and</w:t>
-      </w:r>
-      <w:r>
-        <w:t xml:space="preserve"> </w:t>
-      </w:r>
-      <m:oMath>
-        <m:r>
-          <m:t>3</m:t>
-        </m:r>
-        <m:r>
-          <m:rPr>
-            <m:sty m:val="p"/>
-          </m:rPr>
-          <m:t>×</m:t>
-        </m:r>
-        <m:sSup>
-          <m:e>
-            <m:r>
-              <m:t>10</m:t>
-            </m:r>
-          </m:e>
-          <m:sup>
-            <m:r>
-              <m:rPr>
-                <m:sty m:val="p"/>
-              </m:rPr>
-              <m:t>−</m:t>
-            </m:r>
-            <m:r>
-              <m:t>3</m:t>
-            </m:r>
-          </m:sup>
-        </m:sSup>
-      </m:oMath>
-      <w:r>
-        <w:t xml:space="preserve"> </w:t>
-      </w:r>
-      <w:r>
-        <w:t xml:space="preserve">and batch 256 leave ALiBi models at</w:t>
-      </w:r>
-      <w:r>
-        <w:t xml:space="preserve"> </w:t>
-      </w:r>
-      <m:oMath>
+        <w:t xml:space="preserve">is held at the law’s value. So the dependence is real and not the trade-off between the two fitted parameters. As a description of the parameters, the separable law explains 80% of the variance of</w:t>
+      </w:r>
+      <w:r>
+        <w:t xml:space="preserve"> </w:t>
+      </w:r>
+      <m:oMath>
+        <m:r>
+          <m:rPr>
+            <m:sty m:val="p"/>
+          </m:rPr>
+          <m:t>log</m:t>
+        </m:r>
         <m:sSup>
           <m:e>
             <m:r>
@@ -5750,44 +7045,27 @@
             </m:r>
           </m:sup>
         </m:sSup>
-        <m:r>
-          <m:rPr>
-            <m:sty m:val="p"/>
-          </m:rPr>
-          <m:t>/</m:t>
-        </m:r>
-        <m:r>
-          <m:t>h</m:t>
-        </m:r>
-        <m:r>
-          <m:rPr>
-            <m:sty m:val="p"/>
-          </m:rPr>
-          <m:t>=</m:t>
-        </m:r>
-        <m:r>
-          <m:t>3.3</m:t>
-        </m:r>
-      </m:oMath>
-      <w:r>
-        <w:t xml:space="preserve">–</w:t>
-      </w:r>
-      <m:oMath>
-        <m:r>
-          <m:t>6.3</m:t>
-        </m:r>
-      </m:oMath>
-      <w:r>
-        <w:t xml:space="preserve">; three times longer training changes</w:t>
-      </w:r>
-      <w:r>
-        <w:t xml:space="preserve"> </w:t>
-      </w:r>
-      <m:oMath>
+      </m:oMath>
+      <w:r>
+        <w:t xml:space="preserve"> </w:t>
+      </w:r>
+      <w:r>
+        <w:t xml:space="preserve">and 68% of</w:t>
+      </w:r>
+      <w:r>
+        <w:t xml:space="preserve"> </w:t>
+      </w:r>
+      <m:oMath>
+        <m:r>
+          <m:rPr>
+            <m:sty m:val="p"/>
+          </m:rPr>
+          <m:t>logit</m:t>
+        </m:r>
         <m:sSup>
           <m:e>
             <m:r>
-              <m:t>h</m:t>
+              <m:t>ε</m:t>
             </m:r>
           </m:e>
           <m:sup>
@@ -5804,49 +7082,18 @@
         <w:t xml:space="preserve"> </w:t>
       </w:r>
       <w:r>
-        <w:t xml:space="preserve">by</w:t>
-      </w:r>
-      <w:r>
-        <w:t xml:space="preserve"> </w:t>
-      </w:r>
-      <m:oMath>
-        <m:r>
-          <m:rPr>
-            <m:sty m:val="p"/>
-          </m:rPr>
-          <m:t>×</m:t>
-        </m:r>
-        <m:r>
-          <m:t>0.76</m:t>
-        </m:r>
-      </m:oMath>
-      <w:r>
-        <w:t xml:space="preserve">–</w:t>
-      </w:r>
-      <m:oMath>
-        <m:r>
-          <m:t>1.17</m:t>
-        </m:r>
-      </m:oMath>
-      <w:r>
-        <w:t xml:space="preserve">. Width 256 brings</w:t>
-      </w:r>
-      <w:r>
-        <w:t xml:space="preserve"> </w:t>
+        <w:t xml:space="preserve">across settings. Adding cross terms does not improve held-out prediction of behaviour (</w:t>
       </w:r>
       <m:oMath>
         <m:sSup>
           <m:e>
             <m:r>
-              <m:t>h</m:t>
+              <m:t>R</m:t>
             </m:r>
           </m:e>
           <m:sup>
             <m:r>
-              <m:rPr>
-                <m:sty m:val="p"/>
-              </m:rPr>
-              <m:t>′</m:t>
+              <m:t>2</m:t>
             </m:r>
           </m:sup>
         </m:sSup>
@@ -5855,76 +7102,10 @@
         <w:t xml:space="preserve"> </w:t>
       </w:r>
       <w:r>
-        <w:t xml:space="preserve">closer to</w:t>
-      </w:r>
-      <w:r>
-        <w:t xml:space="preserve"> </w:t>
-      </w:r>
-      <m:oMath>
-        <m:r>
-          <m:t>h</m:t>
-        </m:r>
-      </m:oMath>
-      <w:r>
-        <w:t xml:space="preserve">, much more for RoPE (</w:t>
-      </w:r>
-      <m:oMath>
-        <m:r>
-          <m:t>1.3</m:t>
-        </m:r>
-      </m:oMath>
-      <w:r>
-        <w:t xml:space="preserve">–</w:t>
-      </w:r>
-      <m:oMath>
-        <m:r>
-          <m:t>1.5</m:t>
-        </m:r>
-        <m:r>
-          <m:rPr>
-            <m:sty m:val="p"/>
-          </m:rPr>
-          <m:t>×</m:t>
-        </m:r>
-      </m:oMath>
-      <w:r>
-        <w:t xml:space="preserve">) than for ALiBi (</w:t>
-      </w:r>
-      <m:oMath>
-        <m:r>
-          <m:t>2.9</m:t>
-        </m:r>
-      </m:oMath>
-      <w:r>
-        <w:t xml:space="preserve">–</w:t>
-      </w:r>
-      <m:oMath>
-        <m:r>
-          <m:t>5.3</m:t>
-        </m:r>
-        <m:r>
-          <m:rPr>
-            <m:sty m:val="p"/>
-          </m:rPr>
-          <m:t>×</m:t>
-        </m:r>
-      </m:oMath>
-      <w:r>
-        <w:t xml:space="preserve">). Training with 20% of the loss on extra conflict sequences, whose answers are sampled from the Bayes predictive, roughly halves the excess abruptness of the switch but raises the excess loss on ordinary data two- to four-fold.</w:t>
+        <w:t xml:space="preserve">0.85 vs. 0.87).</w:t>
       </w:r>
     </w:p>
-    <w:bookmarkEnd w:id="44"/>
-    <w:bookmarkEnd w:id="45"/>
-    <w:bookmarkStart w:id="50" w:name="sec:causal"/>
-    <w:p>
-      <w:pPr>
-        <w:pStyle w:val="Heading1"/>
-      </w:pPr>
-      <w:r>
-        <w:t xml:space="preserve">The fading rate sets the believed switch rate</w:t>
-      </w:r>
-    </w:p>
-    <w:bookmarkStart w:id="49" w:name="fig:slope"/>
+    <w:bookmarkStart w:id="47" w:name="fig:scope"/>
     <w:p>
       <w:pPr>
         <w:pStyle w:val="CaptionedFigure"/>
@@ -5932,20 +7113,2542 @@
       <w:r>
         <w:drawing>
           <wp:inline>
-            <wp:extent cx="5334000" cy="1909010"/>
+            <wp:extent cx="4533900" cy="2133600"/>
             <wp:effectExtent b="0" l="0" r="0" t="0"/>
-            <wp:docPr descr="" title="" id="47" name="Picture"/>
+            <wp:docPr descr="" title="" id="45" name="Picture"/>
             <a:graphic>
               <a:graphicData uri="http://schemas.openxmlformats.org/drawingml/2006/picture">
                 <pic:pic>
                   <pic:nvPicPr>
-                    <pic:cNvPr descr="figures/fig_slope.png" id="48" name="Picture"/>
+                    <pic:cNvPr descr="figures/scope_r2.png" id="46" name="Picture"/>
                     <pic:cNvPicPr>
                       <a:picLocks noChangeArrowheads="1" noChangeAspect="1"/>
                     </pic:cNvPicPr>
                   </pic:nvPicPr>
                   <pic:blipFill>
-                    <a:blip r:embed="rId46"/>
+                    <a:blip r:embed="rId44"/>
+                    <a:stretch>
+                      <a:fillRect/>
+                    </a:stretch>
+                  </pic:blipFill>
+                  <pic:spPr bwMode="auto">
+                    <a:xfrm>
+                      <a:off x="0" y="0"/>
+                      <a:ext cx="4533900" cy="2133600"/>
+                    </a:xfrm>
+                    <a:prstGeom prst="rect">
+                      <a:avLst/>
+                    </a:prstGeom>
+                    <a:noFill/>
+                    <a:ln w="9525">
+                      <a:noFill/>
+                      <a:headEnd/>
+                      <a:tailEnd/>
+                    </a:ln>
+                  </pic:spPr>
+                </pic:pic>
+              </a:graphicData>
+            </a:graphic>
+          </wp:inline>
+        </w:drawing>
+      </w:r>
+    </w:p>
+    <w:p>
+      <w:pPr>
+        <w:pStyle w:val="ImageCaption"/>
+      </w:pPr>
+      <w:r>
+        <w:rPr>
+          <w:b/>
+          <w:bCs/>
+        </w:rPr>
+        <w:t xml:space="preserve">The frozen law on 63 models trained after it was fixed</w:t>
+      </w:r>
+      <w:r>
+        <w:t xml:space="preserve"> </w:t>
+      </w:r>
+      <w:r>
+        <w:t xml:space="preserve">(run 6). Points: median</w:t>
+      </w:r>
+      <w:r>
+        <w:t xml:space="preserve"> </w:t>
+      </w:r>
+      <m:oMath>
+        <m:sSup>
+          <m:e>
+            <m:r>
+              <m:t>R</m:t>
+            </m:r>
+          </m:e>
+          <m:sup>
+            <m:r>
+              <m:t>2</m:t>
+            </m:r>
+          </m:sup>
+        </m:sSup>
+      </m:oMath>
+      <w:r>
+        <w:t xml:space="preserve"> </w:t>
+      </w:r>
+      <w:r>
+        <w:t xml:space="preserve">of the predicted probe surface (bars: IQR over models); ticks: each model’s own Bayes</w:t>
+      </w:r>
+      <m:oMath>
+        <m:r>
+          <m:rPr>
+            <m:sty m:val="p"/>
+          </m:rPr>
+          <m:t>(</m:t>
+        </m:r>
+        <m:sSup>
+          <m:e>
+            <m:r>
+              <m:t>h</m:t>
+            </m:r>
+          </m:e>
+          <m:sup>
+            <m:r>
+              <m:rPr>
+                <m:sty m:val="p"/>
+              </m:rPr>
+              <m:t>′</m:t>
+            </m:r>
+          </m:sup>
+        </m:sSup>
+        <m:r>
+          <m:rPr>
+            <m:sty m:val="p"/>
+          </m:rPr>
+          <m:t>,</m:t>
+        </m:r>
+        <m:sSup>
+          <m:e>
+            <m:r>
+              <m:t>ε</m:t>
+            </m:r>
+          </m:e>
+          <m:sup>
+            <m:r>
+              <m:rPr>
+                <m:sty m:val="p"/>
+              </m:rPr>
+              <m:t>′</m:t>
+            </m:r>
+          </m:sup>
+        </m:sSup>
+        <m:r>
+          <m:rPr>
+            <m:sty m:val="p"/>
+          </m:rPr>
+          <m:t>)</m:t>
+        </m:r>
+      </m:oMath>
+      <w:r>
+        <w:t xml:space="preserve"> </w:t>
+      </w:r>
+      <w:r>
+        <w:t xml:space="preserve">fit, the ceiling for the functional form. Task variants:</w:t>
+      </w:r>
+      <w:r>
+        <w:t xml:space="preserve"> </w:t>
+      </w:r>
+      <m:oMath>
+        <m:r>
+          <m:t>V</m:t>
+        </m:r>
+        <m:r>
+          <m:rPr>
+            <m:sty m:val="p"/>
+          </m:rPr>
+          <m:t>∈</m:t>
+        </m:r>
+        <m:r>
+          <m:rPr>
+            <m:sty m:val="p"/>
+          </m:rPr>
+          <m:t>{</m:t>
+        </m:r>
+        <m:r>
+          <m:t>32</m:t>
+        </m:r>
+        <m:r>
+          <m:rPr>
+            <m:sty m:val="p"/>
+          </m:rPr>
+          <m:t>,</m:t>
+        </m:r>
+        <m:r>
+          <m:t>128</m:t>
+        </m:r>
+        <m:r>
+          <m:rPr>
+            <m:sty m:val="p"/>
+          </m:rPr>
+          <m:t>}</m:t>
+        </m:r>
+      </m:oMath>
+      <w:r>
+        <w:t xml:space="preserve">,</w:t>
+      </w:r>
+      <w:r>
+        <w:t xml:space="preserve"> </w:t>
+      </w:r>
+      <m:oMath>
+        <m:r>
+          <m:t>K</m:t>
+        </m:r>
+        <m:r>
+          <m:rPr>
+            <m:sty m:val="p"/>
+          </m:rPr>
+          <m:t>∈</m:t>
+        </m:r>
+        <m:r>
+          <m:rPr>
+            <m:sty m:val="p"/>
+          </m:rPr>
+          <m:t>{</m:t>
+        </m:r>
+        <m:r>
+          <m:t>8</m:t>
+        </m:r>
+        <m:r>
+          <m:rPr>
+            <m:sty m:val="p"/>
+          </m:rPr>
+          <m:t>,</m:t>
+        </m:r>
+        <m:r>
+          <m:t>32</m:t>
+        </m:r>
+        <m:r>
+          <m:rPr>
+            <m:sty m:val="p"/>
+          </m:rPr>
+          <m:t>}</m:t>
+        </m:r>
+      </m:oMath>
+      <w:r>
+        <w:t xml:space="preserve">, uniform keys, uniform typos. The RoPE row applies the ALiBi constants, which do not transfer; RoPE’s own constants reach 0.89 on held-out settings.</w:t>
+      </w:r>
+    </w:p>
+    <w:bookmarkEnd w:id="47"/>
+    <w:bookmarkEnd w:id="48"/>
+    <w:bookmarkStart w:id="49" w:name="new-settings-pre-registered."/>
+    <w:p>
+      <w:pPr>
+        <w:pStyle w:val="Heading4"/>
+      </w:pPr>
+      <w:r>
+        <w:t xml:space="preserve">New settings (pre-registered).</w:t>
+      </w:r>
+    </w:p>
+    <w:p>
+      <w:pPr>
+        <w:pStyle w:val="FirstParagraph"/>
+      </w:pPr>
+      <w:r>
+        <w:t xml:space="preserve">We froze Eq. </w:t>
+      </w:r>
+      <w:hyperlink w:anchor="eq:laws">
+        <w:r>
+          <w:rPr>
+            <w:rStyle w:val="Hyperlink"/>
+          </w:rPr>
+          <w:t xml:space="preserve">[eq:laws]</w:t>
+        </w:r>
+      </w:hyperlink>
+      <w:r>
+        <w:t xml:space="preserve"> </w:t>
+      </w:r>
+      <w:r>
+        <w:t xml:space="preserve">(with median scale and offset) and trained 21 new models (Figure </w:t>
+      </w:r>
+      <w:hyperlink w:anchor="fig:scope">
+        <w:r>
+          <w:rPr>
+            <w:rStyle w:val="Hyperlink"/>
+          </w:rPr>
+          <w:t xml:space="preserve">5</w:t>
+        </w:r>
+      </w:hyperlink>
+      <w:r>
+        <w:t xml:space="preserve">) at seven</w:t>
+      </w:r>
+      <w:r>
+        <w:t xml:space="preserve"> </w:t>
+      </w:r>
+      <m:oMath>
+        <m:r>
+          <m:rPr>
+            <m:sty m:val="p"/>
+          </m:rPr>
+          <m:t>(</m:t>
+        </m:r>
+        <m:r>
+          <m:t>h</m:t>
+        </m:r>
+        <m:r>
+          <m:rPr>
+            <m:sty m:val="p"/>
+          </m:rPr>
+          <m:t>,</m:t>
+        </m:r>
+        <m:r>
+          <m:t>ε</m:t>
+        </m:r>
+        <m:r>
+          <m:rPr>
+            <m:sty m:val="p"/>
+          </m:rPr>
+          <m:t>)</m:t>
+        </m:r>
+      </m:oMath>
+      <w:r>
+        <w:t xml:space="preserve"> </w:t>
+      </w:r>
+      <w:r>
+        <w:t xml:space="preserve">settings that had not been used to fit it.</w:t>
+      </w:r>
+    </w:p>
+    <w:p>
+      <w:pPr>
+        <w:numPr>
+          <w:ilvl w:val="0"/>
+          <w:numId w:val="1003"/>
+        </w:numPr>
+      </w:pPr>
+      <w:r>
+        <w:rPr>
+          <w:i/>
+          <w:iCs/>
+        </w:rPr>
+        <w:t xml:space="preserve">Inside the fitted range</w:t>
+      </w:r>
+      <w:r>
+        <w:t xml:space="preserve">, at</w:t>
+      </w:r>
+      <w:r>
+        <w:t xml:space="preserve"> </w:t>
+      </w:r>
+      <m:oMath>
+        <m:r>
+          <m:rPr>
+            <m:sty m:val="p"/>
+          </m:rPr>
+          <m:t>(</m:t>
+        </m:r>
+        <m:r>
+          <m:t>0.005</m:t>
+        </m:r>
+        <m:r>
+          <m:rPr>
+            <m:sty m:val="p"/>
+          </m:rPr>
+          <m:t>,</m:t>
+        </m:r>
+        <m:r>
+          <m:t>0.07</m:t>
+        </m:r>
+        <m:r>
+          <m:rPr>
+            <m:sty m:val="p"/>
+          </m:rPr>
+          <m:t>)</m:t>
+        </m:r>
+      </m:oMath>
+      <w:r>
+        <w:t xml:space="preserve">,</w:t>
+      </w:r>
+      <w:r>
+        <w:t xml:space="preserve"> </w:t>
+      </w:r>
+      <m:oMath>
+        <m:r>
+          <m:rPr>
+            <m:sty m:val="p"/>
+          </m:rPr>
+          <m:t>(</m:t>
+        </m:r>
+        <m:r>
+          <m:t>0.02</m:t>
+        </m:r>
+        <m:r>
+          <m:rPr>
+            <m:sty m:val="p"/>
+          </m:rPr>
+          <m:t>,</m:t>
+        </m:r>
+        <m:r>
+          <m:t>0.15</m:t>
+        </m:r>
+        <m:r>
+          <m:rPr>
+            <m:sty m:val="p"/>
+          </m:rPr>
+          <m:t>)</m:t>
+        </m:r>
+      </m:oMath>
+      <w:r>
+        <w:t xml:space="preserve"> </w:t>
+      </w:r>
+      <w:r>
+        <w:t xml:space="preserve">and</w:t>
+      </w:r>
+      <w:r>
+        <w:t xml:space="preserve"> </w:t>
+      </w:r>
+      <m:oMath>
+        <m:r>
+          <m:rPr>
+            <m:sty m:val="p"/>
+          </m:rPr>
+          <m:t>(</m:t>
+        </m:r>
+        <m:r>
+          <m:t>0.007</m:t>
+        </m:r>
+        <m:r>
+          <m:rPr>
+            <m:sty m:val="p"/>
+          </m:rPr>
+          <m:t>,</m:t>
+        </m:r>
+        <m:r>
+          <m:t>0.25</m:t>
+        </m:r>
+        <m:r>
+          <m:rPr>
+            <m:sty m:val="p"/>
+          </m:rPr>
+          <m:t>)</m:t>
+        </m:r>
+      </m:oMath>
+      <w:r>
+        <w:t xml:space="preserve">, the law predicts the new models’ probe surfaces at median</w:t>
+      </w:r>
+      <w:r>
+        <w:t xml:space="preserve"> </w:t>
+      </w:r>
+      <m:oMath>
+        <m:sSup>
+          <m:e>
+            <m:r>
+              <m:t>R</m:t>
+            </m:r>
+          </m:e>
+          <m:sup>
+            <m:r>
+              <m:t>2</m:t>
+            </m:r>
+          </m:sup>
+        </m:sSup>
+        <m:r>
+          <m:rPr>
+            <m:sty m:val="p"/>
+          </m:rPr>
+          <m:t>=</m:t>
+        </m:r>
+        <m:r>
+          <m:t>0.89</m:t>
+        </m:r>
+      </m:oMath>
+      <w:r>
+        <w:t xml:space="preserve">–</w:t>
+      </w:r>
+      <m:oMath>
+        <m:r>
+          <m:t>0.94</m:t>
+        </m:r>
+      </m:oMath>
+      <w:r>
+        <w:t xml:space="preserve">, with</w:t>
+      </w:r>
+      <w:r>
+        <w:t xml:space="preserve"> </w:t>
+      </w:r>
+      <m:oMath>
+        <m:sSup>
+          <m:e>
+            <m:r>
+              <m:t>h</m:t>
+            </m:r>
+          </m:e>
+          <m:sup>
+            <m:r>
+              <m:rPr>
+                <m:sty m:val="p"/>
+              </m:rPr>
+              <m:t>′</m:t>
+            </m:r>
+          </m:sup>
+        </m:sSup>
+      </m:oMath>
+      <w:r>
+        <w:t xml:space="preserve"> </w:t>
+      </w:r>
+      <w:r>
+        <w:t xml:space="preserve">within a factor of 1.7.</w:t>
+      </w:r>
+    </w:p>
+    <w:p>
+      <w:pPr>
+        <w:numPr>
+          <w:ilvl w:val="0"/>
+          <w:numId w:val="1003"/>
+        </w:numPr>
+      </w:pPr>
+      <w:r>
+        <w:rPr>
+          <w:i/>
+          <w:iCs/>
+        </w:rPr>
+        <w:t xml:space="preserve">Outside it</w:t>
+      </w:r>
+      <w:r>
+        <w:t xml:space="preserve">, the law holds at</w:t>
+      </w:r>
+      <w:r>
+        <w:t xml:space="preserve"> </w:t>
+      </w:r>
+      <m:oMath>
+        <m:r>
+          <m:t>ε</m:t>
+        </m:r>
+        <m:r>
+          <m:rPr>
+            <m:sty m:val="p"/>
+          </m:rPr>
+          <m:t>=</m:t>
+        </m:r>
+        <m:r>
+          <m:t>0.02</m:t>
+        </m:r>
+      </m:oMath>
+      <w:r>
+        <w:t xml:space="preserve"> </w:t>
+      </w:r>
+      <w:r>
+        <w:t xml:space="preserve">(</w:t>
+      </w:r>
+      <m:oMath>
+        <m:sSup>
+          <m:e>
+            <m:r>
+              <m:t>R</m:t>
+            </m:r>
+          </m:e>
+          <m:sup>
+            <m:r>
+              <m:t>2</m:t>
+            </m:r>
+          </m:sup>
+        </m:sSup>
+        <m:r>
+          <m:rPr>
+            <m:sty m:val="p"/>
+          </m:rPr>
+          <m:t>=</m:t>
+        </m:r>
+        <m:r>
+          <m:t>0.88</m:t>
+        </m:r>
+      </m:oMath>
+      <w:r>
+        <w:t xml:space="preserve">) and narrowly misses at</w:t>
+      </w:r>
+      <w:r>
+        <w:t xml:space="preserve"> </w:t>
+      </w:r>
+      <m:oMath>
+        <m:r>
+          <m:t>h</m:t>
+        </m:r>
+        <m:r>
+          <m:rPr>
+            <m:sty m:val="p"/>
+          </m:rPr>
+          <m:t>=</m:t>
+        </m:r>
+        <m:r>
+          <m:t>0.001</m:t>
+        </m:r>
+      </m:oMath>
+      <w:r>
+        <w:t xml:space="preserve"> </w:t>
+      </w:r>
+      <w:r>
+        <w:t xml:space="preserve">and</w:t>
+      </w:r>
+      <w:r>
+        <w:t xml:space="preserve"> </w:t>
+      </w:r>
+      <m:oMath>
+        <m:r>
+          <m:t>h</m:t>
+        </m:r>
+        <m:r>
+          <m:rPr>
+            <m:sty m:val="p"/>
+          </m:rPr>
+          <m:t>=</m:t>
+        </m:r>
+        <m:r>
+          <m:t>0.06</m:t>
+        </m:r>
+      </m:oMath>
+      <w:r>
+        <w:t xml:space="preserve"> </w:t>
+      </w:r>
+      <w:r>
+        <w:t xml:space="preserve">(0.72, 0.73). It fails at</w:t>
+      </w:r>
+      <w:r>
+        <w:t xml:space="preserve"> </w:t>
+      </w:r>
+      <m:oMath>
+        <m:r>
+          <m:t>ε</m:t>
+        </m:r>
+        <m:r>
+          <m:rPr>
+            <m:sty m:val="p"/>
+          </m:rPr>
+          <m:t>=</m:t>
+        </m:r>
+        <m:r>
+          <m:t>0.4</m:t>
+        </m:r>
+      </m:oMath>
+      <w:r>
+        <w:t xml:space="preserve">, where the models’ surfaces are nearly flat: the absolute error there (0.71 nats) matches that on the fitted grid (0.68), but the variance is tiny.</w:t>
+      </w:r>
+    </w:p>
+    <w:p>
+      <w:pPr>
+        <w:pStyle w:val="FirstParagraph"/>
+      </w:pPr>
+      <w:r>
+        <w:t xml:space="preserve">Over all new models, the median</w:t>
+      </w:r>
+      <w:r>
+        <w:t xml:space="preserve"> </w:t>
+      </w:r>
+      <m:oMath>
+        <m:sSup>
+          <m:e>
+            <m:r>
+              <m:t>R</m:t>
+            </m:r>
+          </m:e>
+          <m:sup>
+            <m:r>
+              <m:t>2</m:t>
+            </m:r>
+          </m:sup>
+        </m:sSup>
+      </m:oMath>
+      <w:r>
+        <w:t xml:space="preserve"> </w:t>
+      </w:r>
+      <w:r>
+        <w:t xml:space="preserve">is 0.87, equal to the leave-one-setting-out estimate made before these runs. Bayes at fitted parameters again beats both counters on held-out gaps in all 20 non-flat models.</w:t>
+      </w:r>
+    </w:p>
+    <w:p>
+      <w:pPr>
+        <w:pStyle w:val="BodyText"/>
+      </w:pPr>
+      <w:r>
+        <w:t xml:space="preserve">A post-hoc analysis locates the failures. The predicted beliefs</w:t>
+      </w:r>
+      <w:r>
+        <w:t xml:space="preserve"> </w:t>
+      </w:r>
+      <m:oMath>
+        <m:r>
+          <m:rPr>
+            <m:sty m:val="p"/>
+          </m:rPr>
+          <m:t>(</m:t>
+        </m:r>
+        <m:sSup>
+          <m:e>
+            <m:r>
+              <m:t>h</m:t>
+            </m:r>
+          </m:e>
+          <m:sup>
+            <m:r>
+              <m:rPr>
+                <m:sty m:val="p"/>
+              </m:rPr>
+              <m:t>′</m:t>
+            </m:r>
+          </m:sup>
+        </m:sSup>
+        <m:r>
+          <m:rPr>
+            <m:sty m:val="p"/>
+          </m:rPr>
+          <m:t>,</m:t>
+        </m:r>
+        <m:sSup>
+          <m:e>
+            <m:r>
+              <m:t>ε</m:t>
+            </m:r>
+          </m:e>
+          <m:sup>
+            <m:r>
+              <m:rPr>
+                <m:sty m:val="p"/>
+              </m:rPr>
+              <m:t>′</m:t>
+            </m:r>
+          </m:sup>
+        </m:sSup>
+        <m:r>
+          <m:rPr>
+            <m:sty m:val="p"/>
+          </m:rPr>
+          <m:t>)</m:t>
+        </m:r>
+      </m:oMath>
+      <w:r>
+        <w:t xml:space="preserve"> </w:t>
+      </w:r>
+      <w:r>
+        <w:t xml:space="preserve">transfer; what does not transfer to the edges is the single output scale</w:t>
+      </w:r>
+      <w:r>
+        <w:t xml:space="preserve"> </w:t>
+      </w:r>
+      <m:oMath>
+        <m:r>
+          <m:t>b</m:t>
+        </m:r>
+      </m:oMath>
+      <w:r>
+        <w:t xml:space="preserve">, which ranges from 0.87 at</w:t>
+      </w:r>
+      <w:r>
+        <w:t xml:space="preserve"> </w:t>
+      </w:r>
+      <m:oMath>
+        <m:r>
+          <m:t>ε</m:t>
+        </m:r>
+        <m:r>
+          <m:rPr>
+            <m:sty m:val="p"/>
+          </m:rPr>
+          <m:t>=</m:t>
+        </m:r>
+        <m:r>
+          <m:t>0.4</m:t>
+        </m:r>
+      </m:oMath>
+      <w:r>
+        <w:t xml:space="preserve"> </w:t>
+      </w:r>
+      <w:r>
+        <w:t xml:space="preserve">to 4.8 at</w:t>
+      </w:r>
+      <w:r>
+        <w:t xml:space="preserve"> </w:t>
+      </w:r>
+      <m:oMath>
+        <m:r>
+          <m:t>h</m:t>
+        </m:r>
+        <m:r>
+          <m:rPr>
+            <m:sty m:val="p"/>
+          </m:rPr>
+          <m:t>=</m:t>
+        </m:r>
+        <m:r>
+          <m:t>0.001</m:t>
+        </m:r>
+      </m:oMath>
+      <w:r>
+        <w:t xml:space="preserve">. There is also a dependence of</w:t>
+      </w:r>
+      <w:r>
+        <w:t xml:space="preserve"> </w:t>
+      </w:r>
+      <m:oMath>
+        <m:sSup>
+          <m:e>
+            <m:r>
+              <m:t>ε</m:t>
+            </m:r>
+          </m:e>
+          <m:sup>
+            <m:r>
+              <m:rPr>
+                <m:sty m:val="p"/>
+              </m:rPr>
+              <m:t>′</m:t>
+            </m:r>
+          </m:sup>
+        </m:sSup>
+      </m:oMath>
+      <w:r>
+        <w:t xml:space="preserve"> </w:t>
+      </w:r>
+      <w:r>
+        <w:t xml:space="preserve">on</w:t>
+      </w:r>
+      <w:r>
+        <w:t xml:space="preserve"> </w:t>
+      </w:r>
+      <m:oMath>
+        <m:r>
+          <m:t>h</m:t>
+        </m:r>
+      </m:oMath>
+      <w:r>
+        <w:t xml:space="preserve">: a variant of the law with cross terms, fitted on the original grid only, predicts</w:t>
+      </w:r>
+      <w:r>
+        <w:t xml:space="preserve"> </w:t>
+      </w:r>
+      <m:oMath>
+        <m:r>
+          <m:t>h</m:t>
+        </m:r>
+        <m:r>
+          <m:rPr>
+            <m:sty m:val="p"/>
+          </m:rPr>
+          <m:t>=</m:t>
+        </m:r>
+        <m:r>
+          <m:t>0.06</m:t>
+        </m:r>
+      </m:oMath>
+      <w:r>
+        <w:t xml:space="preserve"> </w:t>
+      </w:r>
+      <w:r>
+        <w:t xml:space="preserve">at</w:t>
+      </w:r>
+      <w:r>
+        <w:t xml:space="preserve"> </w:t>
+      </w:r>
+      <m:oMath>
+        <m:sSup>
+          <m:e>
+            <m:r>
+              <m:t>R</m:t>
+            </m:r>
+          </m:e>
+          <m:sup>
+            <m:r>
+              <m:t>2</m:t>
+            </m:r>
+          </m:sup>
+        </m:sSup>
+        <m:r>
+          <m:rPr>
+            <m:sty m:val="p"/>
+          </m:rPr>
+          <m:t>=</m:t>
+        </m:r>
+        <m:r>
+          <m:t>0.93</m:t>
+        </m:r>
+      </m:oMath>
+      <w:r>
+        <w:t xml:space="preserve">.</w:t>
+      </w:r>
+    </w:p>
+    <w:bookmarkEnd w:id="49"/>
+    <w:bookmarkStart w:id="50" w:name="context-length-pre-registered."/>
+    <w:p>
+      <w:pPr>
+        <w:pStyle w:val="Heading4"/>
+      </w:pPr>
+      <w:r>
+        <w:t xml:space="preserve">Context length (pre-registered).</w:t>
+      </w:r>
+    </w:p>
+    <w:p>
+      <w:pPr>
+        <w:pStyle w:val="FirstParagraph"/>
+      </w:pPr>
+      <w:r>
+        <w:t xml:space="preserve">We had suspected that the exponent below 1 comes from switch timescales longer than the context. That predicted a lower</w:t>
+      </w:r>
+      <w:r>
+        <w:t xml:space="preserve"> </w:t>
+      </w:r>
+      <m:oMath>
+        <m:sSup>
+          <m:e>
+            <m:r>
+              <m:t>h</m:t>
+            </m:r>
+          </m:e>
+          <m:sup>
+            <m:r>
+              <m:rPr>
+                <m:sty m:val="p"/>
+              </m:rPr>
+              <m:t>′</m:t>
+            </m:r>
+          </m:sup>
+        </m:sSup>
+      </m:oMath>
+      <w:r>
+        <w:t xml:space="preserve"> </w:t>
+      </w:r>
+      <w:r>
+        <w:t xml:space="preserve">at small</w:t>
+      </w:r>
+      <w:r>
+        <w:t xml:space="preserve"> </w:t>
+      </w:r>
+      <m:oMath>
+        <m:r>
+          <m:t>h</m:t>
+        </m:r>
+      </m:oMath>
+      <w:r>
+        <w:t xml:space="preserve"> </w:t>
+      </w:r>
+      <w:r>
+        <w:t xml:space="preserve">and a larger exponent with longer contexts. Training at</w:t>
+      </w:r>
+      <w:r>
+        <w:t xml:space="preserve"> </w:t>
+      </w:r>
+      <m:oMath>
+        <m:r>
+          <m:t>N</m:t>
+        </m:r>
+        <m:r>
+          <m:rPr>
+            <m:sty m:val="p"/>
+          </m:rPr>
+          <m:t>=</m:t>
+        </m:r>
+        <m:r>
+          <m:t>192</m:t>
+        </m:r>
+      </m:oMath>
+      <w:r>
+        <w:t xml:space="preserve"> </w:t>
+      </w:r>
+      <w:r>
+        <w:t xml:space="preserve">and</w:t>
+      </w:r>
+      <w:r>
+        <w:t xml:space="preserve"> </w:t>
+      </w:r>
+      <m:oMath>
+        <m:r>
+          <m:t>512</m:t>
+        </m:r>
+      </m:oMath>
+      <w:r>
+        <w:t xml:space="preserve"> </w:t>
+      </w:r>
+      <w:r>
+        <w:t xml:space="preserve">pairs (versus 256) refuted this. At</w:t>
+      </w:r>
+      <w:r>
+        <w:t xml:space="preserve"> </w:t>
+      </w:r>
+      <m:oMath>
+        <m:r>
+          <m:t>h</m:t>
+        </m:r>
+        <m:r>
+          <m:rPr>
+            <m:sty m:val="p"/>
+          </m:rPr>
+          <m:t>=</m:t>
+        </m:r>
+        <m:r>
+          <m:t>0.003</m:t>
+        </m:r>
+      </m:oMath>
+      <w:r>
+        <w:t xml:space="preserve">,</w:t>
+      </w:r>
+      <w:r>
+        <w:t xml:space="preserve"> </w:t>
+      </w:r>
+      <m:oMath>
+        <m:sSup>
+          <m:e>
+            <m:r>
+              <m:t>h</m:t>
+            </m:r>
+          </m:e>
+          <m:sup>
+            <m:r>
+              <m:rPr>
+                <m:sty m:val="p"/>
+              </m:rPr>
+              <m:t>′</m:t>
+            </m:r>
+          </m:sup>
+        </m:sSup>
+      </m:oMath>
+      <w:r>
+        <w:t xml:space="preserve"> </w:t>
+      </w:r>
+      <w:r>
+        <w:t xml:space="preserve">is</w:t>
+      </w:r>
+      <w:r>
+        <w:t xml:space="preserve"> </w:t>
+      </w:r>
+      <m:oMath>
+        <m:r>
+          <m:t>1.02</m:t>
+        </m:r>
+        <m:r>
+          <m:rPr>
+            <m:sty m:val="p"/>
+          </m:rPr>
+          <m:t>×</m:t>
+        </m:r>
+      </m:oMath>
+      <w:r>
+        <w:t xml:space="preserve"> </w:t>
+      </w:r>
+      <w:r>
+        <w:t xml:space="preserve">its</w:t>
+      </w:r>
+      <w:r>
+        <w:t xml:space="preserve"> </w:t>
+      </w:r>
+      <m:oMath>
+        <m:r>
+          <m:t>N</m:t>
+        </m:r>
+        <m:r>
+          <m:rPr>
+            <m:sty m:val="p"/>
+          </m:rPr>
+          <m:t>=</m:t>
+        </m:r>
+        <m:r>
+          <m:t>256</m:t>
+        </m:r>
+      </m:oMath>
+      <w:r>
+        <w:t xml:space="preserve"> </w:t>
+      </w:r>
+      <w:r>
+        <w:t xml:space="preserve">value at</w:t>
+      </w:r>
+      <w:r>
+        <w:t xml:space="preserve"> </w:t>
+      </w:r>
+      <m:oMath>
+        <m:r>
+          <m:t>N</m:t>
+        </m:r>
+        <m:r>
+          <m:rPr>
+            <m:sty m:val="p"/>
+          </m:rPr>
+          <m:t>=</m:t>
+        </m:r>
+        <m:r>
+          <m:t>512</m:t>
+        </m:r>
+      </m:oMath>
+      <w:r>
+        <w:t xml:space="preserve"> </w:t>
+      </w:r>
+      <w:r>
+        <w:t xml:space="preserve">(the prediction was</w:t>
+      </w:r>
+      <w:r>
+        <w:t xml:space="preserve"> </w:t>
+      </w:r>
+      <m:oMath>
+        <m:r>
+          <m:rPr>
+            <m:sty m:val="p"/>
+          </m:rPr>
+          <m:t>≤</m:t>
+        </m:r>
+        <m:r>
+          <m:t>0.77</m:t>
+        </m:r>
+        <m:r>
+          <m:rPr>
+            <m:sty m:val="p"/>
+          </m:rPr>
+          <m:t>×</m:t>
+        </m:r>
+      </m:oMath>
+      <w:r>
+        <w:t xml:space="preserve">) and</w:t>
+      </w:r>
+      <w:r>
+        <w:t xml:space="preserve"> </w:t>
+      </w:r>
+      <m:oMath>
+        <m:r>
+          <m:t>1.17</m:t>
+        </m:r>
+        <m:r>
+          <m:rPr>
+            <m:sty m:val="p"/>
+          </m:rPr>
+          <m:t>×</m:t>
+        </m:r>
+      </m:oMath>
+      <w:r>
+        <w:t xml:space="preserve"> </w:t>
+      </w:r>
+      <w:r>
+        <w:t xml:space="preserve">at</w:t>
+      </w:r>
+      <w:r>
+        <w:t xml:space="preserve"> </w:t>
+      </w:r>
+      <m:oMath>
+        <m:r>
+          <m:t>N</m:t>
+        </m:r>
+        <m:r>
+          <m:rPr>
+            <m:sty m:val="p"/>
+          </m:rPr>
+          <m:t>=</m:t>
+        </m:r>
+        <m:r>
+          <m:t>192</m:t>
+        </m:r>
+      </m:oMath>
+      <w:r>
+        <w:t xml:space="preserve">. The exponent measured over</w:t>
+      </w:r>
+      <w:r>
+        <w:t xml:space="preserve"> </w:t>
+      </w:r>
+      <m:oMath>
+        <m:r>
+          <m:t>h</m:t>
+        </m:r>
+        <m:r>
+          <m:rPr>
+            <m:sty m:val="p"/>
+          </m:rPr>
+          <m:t>∈</m:t>
+        </m:r>
+        <m:r>
+          <m:rPr>
+            <m:sty m:val="p"/>
+          </m:rPr>
+          <m:t>{</m:t>
+        </m:r>
+        <m:r>
+          <m:t>0.003</m:t>
+        </m:r>
+        <m:r>
+          <m:rPr>
+            <m:sty m:val="p"/>
+          </m:rPr>
+          <m:t>,</m:t>
+        </m:r>
+        <m:r>
+          <m:t>0.01</m:t>
+        </m:r>
+        <m:r>
+          <m:rPr>
+            <m:sty m:val="p"/>
+          </m:rPr>
+          <m:t>,</m:t>
+        </m:r>
+        <m:r>
+          <m:t>0.03</m:t>
+        </m:r>
+        <m:r>
+          <m:rPr>
+            <m:sty m:val="p"/>
+          </m:rPr>
+          <m:t>}</m:t>
+        </m:r>
+      </m:oMath>
+      <w:r>
+        <w:t xml:space="preserve"> </w:t>
+      </w:r>
+      <w:r>
+        <w:t xml:space="preserve">is 0.63, 0.67 and 0.62. The frozen law predicts the models at all three lengths equally well (median</w:t>
+      </w:r>
+      <w:r>
+        <w:t xml:space="preserve"> </w:t>
+      </w:r>
+      <m:oMath>
+        <m:sSup>
+          <m:e>
+            <m:r>
+              <m:t>R</m:t>
+            </m:r>
+          </m:e>
+          <m:sup>
+            <m:r>
+              <m:t>2</m:t>
+            </m:r>
+          </m:sup>
+        </m:sSup>
+        <m:r>
+          <m:rPr>
+            <m:sty m:val="p"/>
+          </m:rPr>
+          <m:t>=</m:t>
+        </m:r>
+        <m:r>
+          <m:t>0.90</m:t>
+        </m:r>
+      </m:oMath>
+      <w:r>
+        <w:t xml:space="preserve">), so its constants do not depend on context length in this range.</w:t>
+      </w:r>
+    </w:p>
+    <w:bookmarkEnd w:id="50"/>
+    <w:bookmarkStart w:id="51" w:name="X4e9996d824916448f090c21ddd61d99d163a3e7"/>
+    <w:p>
+      <w:pPr>
+        <w:pStyle w:val="Heading4"/>
+      </w:pPr>
+      <w:r>
+        <w:t xml:space="preserve">Vocabulary and number of keys (pre-registered).</w:t>
+      </w:r>
+    </w:p>
+    <w:p>
+      <w:pPr>
+        <w:pStyle w:val="FirstParagraph"/>
+      </w:pPr>
+      <w:r>
+        <w:t xml:space="preserve">With the Bayes rule computed for each model’s own</w:t>
+      </w:r>
+      <w:r>
+        <w:t xml:space="preserve"> </w:t>
+      </w:r>
+      <m:oMath>
+        <m:r>
+          <m:t>V</m:t>
+        </m:r>
+      </m:oMath>
+      <w:r>
+        <w:t xml:space="preserve">, the frozen law predicts models trained with</w:t>
+      </w:r>
+      <w:r>
+        <w:t xml:space="preserve"> </w:t>
+      </w:r>
+      <m:oMath>
+        <m:r>
+          <m:t>V</m:t>
+        </m:r>
+        <m:r>
+          <m:rPr>
+            <m:sty m:val="p"/>
+          </m:rPr>
+          <m:t>=</m:t>
+        </m:r>
+        <m:r>
+          <m:t>32</m:t>
+        </m:r>
+      </m:oMath>
+      <w:r>
+        <w:t xml:space="preserve"> </w:t>
+      </w:r>
+      <w:r>
+        <w:t xml:space="preserve">or</w:t>
+      </w:r>
+      <w:r>
+        <w:t xml:space="preserve"> </w:t>
+      </w:r>
+      <m:oMath>
+        <m:r>
+          <m:t>128</m:t>
+        </m:r>
+      </m:oMath>
+      <w:r>
+        <w:t xml:space="preserve"> </w:t>
+      </w:r>
+      <w:r>
+        <w:t xml:space="preserve">values, or</w:t>
+      </w:r>
+      <w:r>
+        <w:t xml:space="preserve"> </w:t>
+      </w:r>
+      <m:oMath>
+        <m:r>
+          <m:t>K</m:t>
+        </m:r>
+        <m:r>
+          <m:rPr>
+            <m:sty m:val="p"/>
+          </m:rPr>
+          <m:t>=</m:t>
+        </m:r>
+        <m:r>
+          <m:t>8</m:t>
+        </m:r>
+      </m:oMath>
+      <w:r>
+        <w:t xml:space="preserve"> </w:t>
+      </w:r>
+      <w:r>
+        <w:t xml:space="preserve">or</w:t>
+      </w:r>
+      <w:r>
+        <w:t xml:space="preserve"> </w:t>
+      </w:r>
+      <m:oMath>
+        <m:r>
+          <m:t>32</m:t>
+        </m:r>
+      </m:oMath>
+      <w:r>
+        <w:t xml:space="preserve"> </w:t>
+      </w:r>
+      <w:r>
+        <w:t xml:space="preserve">keys, at median</w:t>
+      </w:r>
+      <w:r>
+        <w:t xml:space="preserve"> </w:t>
+      </w:r>
+      <m:oMath>
+        <m:sSup>
+          <m:e>
+            <m:r>
+              <m:t>R</m:t>
+            </m:r>
+          </m:e>
+          <m:sup>
+            <m:r>
+              <m:t>2</m:t>
+            </m:r>
+          </m:sup>
+        </m:sSup>
+        <m:r>
+          <m:rPr>
+            <m:sty m:val="p"/>
+          </m:rPr>
+          <m:t>=</m:t>
+        </m:r>
+        <m:r>
+          <m:t>0.89</m:t>
+        </m:r>
+      </m:oMath>
+      <w:r>
+        <w:t xml:space="preserve">–</w:t>
+      </w:r>
+      <m:oMath>
+        <m:r>
+          <m:t>0.94</m:t>
+        </m:r>
+      </m:oMath>
+      <w:r>
+        <w:t xml:space="preserve">, and their</w:t>
+      </w:r>
+      <w:r>
+        <w:t xml:space="preserve"> </w:t>
+      </w:r>
+      <m:oMath>
+        <m:sSup>
+          <m:e>
+            <m:r>
+              <m:t>h</m:t>
+            </m:r>
+          </m:e>
+          <m:sup>
+            <m:r>
+              <m:rPr>
+                <m:sty m:val="p"/>
+              </m:rPr>
+              <m:t>′</m:t>
+            </m:r>
+          </m:sup>
+        </m:sSup>
+      </m:oMath>
+      <w:r>
+        <w:t xml:space="preserve"> </w:t>
+      </w:r>
+      <w:r>
+        <w:t xml:space="preserve">stays within</w:t>
+      </w:r>
+      <w:r>
+        <w:t xml:space="preserve"> </w:t>
+      </w:r>
+      <m:oMath>
+        <m:r>
+          <m:t>0.89</m:t>
+        </m:r>
+      </m:oMath>
+      <w:r>
+        <w:t xml:space="preserve">–</w:t>
+      </w:r>
+      <m:oMath>
+        <m:r>
+          <m:t>1.15</m:t>
+        </m:r>
+        <m:r>
+          <m:rPr>
+            <m:sty m:val="p"/>
+          </m:rPr>
+          <m:t>×</m:t>
+        </m:r>
+      </m:oMath>
+      <w:r>
+        <w:t xml:space="preserve"> </w:t>
+      </w:r>
+      <w:r>
+        <w:t xml:space="preserve">that of the default task. Had the models ignored</w:t>
+      </w:r>
+      <w:r>
+        <w:t xml:space="preserve"> </w:t>
+      </w:r>
+      <m:oMath>
+        <m:r>
+          <m:t>V</m:t>
+        </m:r>
+      </m:oMath>
+      <w:r>
+        <w:t xml:space="preserve">, matching them with the</w:t>
+      </w:r>
+      <w:r>
+        <w:t xml:space="preserve"> </w:t>
+      </w:r>
+      <m:oMath>
+        <m:r>
+          <m:t>V</m:t>
+        </m:r>
+      </m:oMath>
+      <w:r>
+        <w:t xml:space="preserve">-aware Bayes rule would have required</w:t>
+      </w:r>
+      <w:r>
+        <w:t xml:space="preserve"> </w:t>
+      </w:r>
+      <m:oMath>
+        <m:sSup>
+          <m:e>
+            <m:r>
+              <m:t>h</m:t>
+            </m:r>
+          </m:e>
+          <m:sup>
+            <m:r>
+              <m:rPr>
+                <m:sty m:val="p"/>
+              </m:rPr>
+              <m:t>′</m:t>
+            </m:r>
+          </m:sup>
+        </m:sSup>
+      </m:oMath>
+      <w:r>
+        <w:t xml:space="preserve"> </w:t>
+      </w:r>
+      <w:r>
+        <w:t xml:space="preserve">to halve or double. The observed change is about a fifth of that, so the models’ switch-over moves with</w:t>
+      </w:r>
+      <w:r>
+        <w:t xml:space="preserve"> </w:t>
+      </w:r>
+      <m:oMath>
+        <m:r>
+          <m:rPr>
+            <m:sty m:val="p"/>
+          </m:rPr>
+          <m:t>log</m:t>
+        </m:r>
+        <m:r>
+          <m:t>V</m:t>
+        </m:r>
+      </m:oMath>
+      <w:r>
+        <w:t xml:space="preserve"> </w:t>
+      </w:r>
+      <w:r>
+        <w:t xml:space="preserve">much as the Bayes boundary does.</w:t>
+      </w:r>
+    </w:p>
+    <w:bookmarkEnd w:id="51"/>
+    <w:bookmarkStart w:id="52" w:name="X18cf17a56b95e579fa5701139689e19e51881a9"/>
+    <w:p>
+      <w:pPr>
+        <w:pStyle w:val="Heading4"/>
+      </w:pPr>
+      <w:r>
+        <w:t xml:space="preserve">Key frequencies and typo structure (pre-registered).</w:t>
+      </w:r>
+    </w:p>
+    <w:p>
+      <w:pPr>
+        <w:pStyle w:val="FirstParagraph"/>
+      </w:pPr>
+      <w:r>
+        <w:t xml:space="preserve">With uniform instead of Zipf key frequencies the frozen law still holds (</w:t>
+      </w:r>
+      <m:oMath>
+        <m:sSup>
+          <m:e>
+            <m:r>
+              <m:t>R</m:t>
+            </m:r>
+          </m:e>
+          <m:sup>
+            <m:r>
+              <m:t>2</m:t>
+            </m:r>
+          </m:sup>
+        </m:sSup>
+        <m:r>
+          <m:rPr>
+            <m:sty m:val="p"/>
+          </m:rPr>
+          <m:t>=</m:t>
+        </m:r>
+        <m:r>
+          <m:t>0.93</m:t>
+        </m:r>
+      </m:oMath>
+      <w:r>
+        <w:t xml:space="preserve"> </w:t>
+      </w:r>
+      <w:r>
+        <w:t xml:space="preserve">and</w:t>
+      </w:r>
+      <w:r>
+        <w:t xml:space="preserve"> </w:t>
+      </w:r>
+      <m:oMath>
+        <m:r>
+          <m:t>0.83</m:t>
+        </m:r>
+      </m:oMath>
+      <w:r>
+        <w:t xml:space="preserve">;</w:t>
+      </w:r>
+      <w:r>
+        <w:t xml:space="preserve"> </w:t>
+      </w:r>
+      <m:oMath>
+        <m:sSup>
+          <m:e>
+            <m:r>
+              <m:t>h</m:t>
+            </m:r>
+          </m:e>
+          <m:sup>
+            <m:r>
+              <m:rPr>
+                <m:sty m:val="p"/>
+              </m:rPr>
+              <m:t>′</m:t>
+            </m:r>
+          </m:sup>
+        </m:sSup>
+      </m:oMath>
+      <w:r>
+        <w:t xml:space="preserve"> </w:t>
+      </w:r>
+      <w:r>
+        <w:t xml:space="preserve">at</w:t>
+      </w:r>
+      <w:r>
+        <w:t xml:space="preserve"> </w:t>
+      </w:r>
+      <m:oMath>
+        <m:r>
+          <m:t>0.92</m:t>
+        </m:r>
+      </m:oMath>
+      <w:r>
+        <w:t xml:space="preserve"> </w:t>
+      </w:r>
+      <w:r>
+        <w:t xml:space="preserve">and</w:t>
+      </w:r>
+      <w:r>
+        <w:t xml:space="preserve"> </w:t>
+      </w:r>
+      <m:oMath>
+        <m:r>
+          <m:t>0.69</m:t>
+        </m:r>
+        <m:r>
+          <m:rPr>
+            <m:sty m:val="p"/>
+          </m:rPr>
+          <m:t>×</m:t>
+        </m:r>
+      </m:oMath>
+      <w:r>
+        <w:t xml:space="preserve"> </w:t>
+      </w:r>
+      <w:r>
+        <w:t xml:space="preserve">the default). With uniformly random typos it does not (</w:t>
+      </w:r>
+      <m:oMath>
+        <m:sSup>
+          <m:e>
+            <m:r>
+              <m:t>R</m:t>
+            </m:r>
+          </m:e>
+          <m:sup>
+            <m:r>
+              <m:t>2</m:t>
+            </m:r>
+          </m:sup>
+        </m:sSup>
+        <m:r>
+          <m:rPr>
+            <m:sty m:val="p"/>
+          </m:rPr>
+          <m:t>=</m:t>
+        </m:r>
+        <m:r>
+          <m:t>0.17</m:t>
+        </m:r>
+      </m:oMath>
+      <w:r>
+        <w:t xml:space="preserve">,</w:t>
+      </w:r>
+      <w:r>
+        <w:t xml:space="preserve"> </w:t>
+      </w:r>
+      <m:oMath>
+        <m:r>
+          <m:t>0.34</m:t>
+        </m:r>
+      </m:oMath>
+      <w:r>
+        <w:t xml:space="preserve">), which we expected. More importantly, in these models a discounted counter predicts held-out gaps better than the Bayes rule at fitted parameters. This is not an artifact of our fitting range: allowing</w:t>
+      </w:r>
+      <w:r>
+        <w:t xml:space="preserve"> </w:t>
+      </w:r>
+      <m:oMath>
+        <m:sSup>
+          <m:e>
+            <m:r>
+              <m:t>ε</m:t>
+            </m:r>
+          </m:e>
+          <m:sup>
+            <m:r>
+              <m:rPr>
+                <m:sty m:val="p"/>
+              </m:rPr>
+              <m:t>′</m:t>
+            </m:r>
+          </m:sup>
+        </m:sSup>
+      </m:oMath>
+      <w:r>
+        <w:t xml:space="preserve"> </w:t>
+      </w:r>
+      <w:r>
+        <w:t xml:space="preserve">up to 0.95 (any</w:t>
+      </w:r>
+      <w:r>
+        <w:t xml:space="preserve"> </w:t>
+      </w:r>
+      <m:oMath>
+        <m:r>
+          <m:t>ε</m:t>
+        </m:r>
+        <m:r>
+          <m:rPr>
+            <m:sty m:val="p"/>
+          </m:rPr>
+          <m:t>&lt;</m:t>
+        </m:r>
+        <m:r>
+          <m:t>63</m:t>
+        </m:r>
+        <m:r>
+          <m:rPr>
+            <m:sty m:val="p"/>
+          </m:rPr>
+          <m:t>/</m:t>
+        </m:r>
+        <m:r>
+          <m:t>64</m:t>
+        </m:r>
+      </m:oMath>
+      <w:r>
+        <w:t xml:space="preserve"> </w:t>
+      </w:r>
+      <w:r>
+        <w:t xml:space="preserve">is a valid uniform channel) improves the Bayes fit but leaves the counter better in 4 of 5 uniform-typo models, including the three trained without switches. The Bayes-like behaviour therefore depends on structured typos, where a typo is a recognisable variant of the true value. This is consistent with the content discount of typo-variant copies in Section </w:t>
+      </w:r>
+      <w:hyperlink w:anchor="sec:mechanism">
+        <w:r>
+          <w:rPr>
+            <w:rStyle w:val="Hyperlink"/>
+          </w:rPr>
+          <w:t xml:space="preserve">6</w:t>
+        </w:r>
+      </w:hyperlink>
+      <w:r>
+        <w:t xml:space="preserve">, though we have not tested that link directly.</w:t>
+      </w:r>
+    </w:p>
+    <w:bookmarkEnd w:id="52"/>
+    <w:bookmarkStart w:id="53" w:name="rope-pre-registered."/>
+    <w:p>
+      <w:pPr>
+        <w:pStyle w:val="Heading4"/>
+      </w:pPr>
+      <w:r>
+        <w:t xml:space="preserve">RoPE (pre-registered).</w:t>
+      </w:r>
+    </w:p>
+    <w:p>
+      <w:pPr>
+        <w:pStyle w:val="FirstParagraph"/>
+      </w:pPr>
+      <w:r>
+        <w:t xml:space="preserve">Across the same 12-setting grid, RoPE models are again best described by the Bayes rule at fitted parameters (own-fit</w:t>
+      </w:r>
+      <w:r>
+        <w:t xml:space="preserve"> </w:t>
+      </w:r>
+      <m:oMath>
+        <m:sSup>
+          <m:e>
+            <m:r>
+              <m:t>R</m:t>
+            </m:r>
+          </m:e>
+          <m:sup>
+            <m:r>
+              <m:t>2</m:t>
+            </m:r>
+          </m:sup>
+        </m:sSup>
+      </m:oMath>
+      <w:r>
+        <w:t xml:space="preserve"> </w:t>
+      </w:r>
+      <w:r>
+        <w:t xml:space="preserve">0.93–0.97, better than both counters in every model). They are much closer to calibrated:</w:t>
+      </w:r>
+      <w:r>
+        <w:t xml:space="preserve"> </w:t>
+      </w:r>
+      <m:oMath>
+        <m:sSup>
+          <m:e>
+            <m:r>
+              <m:t>h</m:t>
+            </m:r>
+          </m:e>
+          <m:sup>
+            <m:r>
+              <m:rPr>
+                <m:sty m:val="p"/>
+              </m:rPr>
+              <m:t>′</m:t>
+            </m:r>
+          </m:sup>
+        </m:sSup>
+        <m:r>
+          <m:rPr>
+            <m:sty m:val="p"/>
+          </m:rPr>
+          <m:t>/</m:t>
+        </m:r>
+        <m:r>
+          <m:t>h</m:t>
+        </m:r>
+      </m:oMath>
+      <w:r>
+        <w:t xml:space="preserve"> </w:t>
+      </w:r>
+      <w:r>
+        <w:t xml:space="preserve">is</w:t>
+      </w:r>
+      <w:r>
+        <w:t xml:space="preserve"> </w:t>
+      </w:r>
+      <m:oMath>
+        <m:r>
+          <m:t>1.7</m:t>
+        </m:r>
+      </m:oMath>
+      <w:r>
+        <w:t xml:space="preserve">–</w:t>
+      </w:r>
+      <m:oMath>
+        <m:r>
+          <m:t>4.4</m:t>
+        </m:r>
+      </m:oMath>
+      <w:r>
+        <w:t xml:space="preserve"> </w:t>
+      </w:r>
+      <w:r>
+        <w:t xml:space="preserve">against</w:t>
+      </w:r>
+      <w:r>
+        <w:t xml:space="preserve"> </w:t>
+      </w:r>
+      <m:oMath>
+        <m:r>
+          <m:t>2.8</m:t>
+        </m:r>
+      </m:oMath>
+      <w:r>
+        <w:t xml:space="preserve">–</w:t>
+      </w:r>
+      <m:oMath>
+        <m:r>
+          <m:t>14</m:t>
+        </m:r>
+      </m:oMath>
+      <w:r>
+        <w:t xml:space="preserve"> </w:t>
+      </w:r>
+      <w:r>
+        <w:t xml:space="preserve">for ALiBi, and lower at all 12 settings. Their typo belief is nearly exact (</w:t>
+      </w:r>
+      <m:oMath>
+        <m:r>
+          <m:rPr>
+            <m:sty m:val="p"/>
+          </m:rPr>
+          <m:t>logit</m:t>
+        </m:r>
+        <m:sSup>
+          <m:e>
+            <m:r>
+              <m:t>ε</m:t>
+            </m:r>
+          </m:e>
+          <m:sup>
+            <m:r>
+              <m:rPr>
+                <m:sty m:val="p"/>
+              </m:rPr>
+              <m:t>′</m:t>
+            </m:r>
+          </m:sup>
+        </m:sSup>
+        <m:r>
+          <m:rPr>
+            <m:sty m:val="p"/>
+          </m:rPr>
+          <m:t>=</m:t>
+        </m:r>
+        <m:r>
+          <m:t>0.01</m:t>
+        </m:r>
+        <m:r>
+          <m:rPr>
+            <m:sty m:val="p"/>
+          </m:rPr>
+          <m:t>+</m:t>
+        </m:r>
+        <m:r>
+          <m:t>1.02</m:t>
+        </m:r>
+        <m:r>
+          <m:rPr>
+            <m:sty m:val="p"/>
+          </m:rPr>
+          <m:t>logit</m:t>
+        </m:r>
+        <m:r>
+          <m:t>ε</m:t>
+        </m:r>
+      </m:oMath>
+      <w:r>
+        <w:t xml:space="preserve">,</w:t>
+      </w:r>
+      <w:r>
+        <w:t xml:space="preserve"> </w:t>
+      </w:r>
+      <m:oMath>
+        <m:sSup>
+          <m:e>
+            <m:r>
+              <m:t>R</m:t>
+            </m:r>
+          </m:e>
+          <m:sup>
+            <m:r>
+              <m:t>2</m:t>
+            </m:r>
+          </m:sup>
+        </m:sSup>
+        <m:r>
+          <m:rPr>
+            <m:sty m:val="p"/>
+          </m:rPr>
+          <m:t>=</m:t>
+        </m:r>
+        <m:r>
+          <m:t>0.91</m:t>
+        </m:r>
+      </m:oMath>
+      <w:r>
+        <w:t xml:space="preserve">). A law with RoPE’s own constants predicts held-out settings at median</w:t>
+      </w:r>
+      <w:r>
+        <w:t xml:space="preserve"> </w:t>
+      </w:r>
+      <m:oMath>
+        <m:sSup>
+          <m:e>
+            <m:r>
+              <m:t>R</m:t>
+            </m:r>
+          </m:e>
+          <m:sup>
+            <m:r>
+              <m:t>2</m:t>
+            </m:r>
+          </m:sup>
+        </m:sSup>
+        <m:r>
+          <m:rPr>
+            <m:sty m:val="p"/>
+          </m:rPr>
+          <m:t>=</m:t>
+        </m:r>
+        <m:r>
+          <m:t>0.89</m:t>
+        </m:r>
+      </m:oMath>
+      <w:r>
+        <w:t xml:space="preserve">, but our pre-registered criterion for the same functional form failed: a power law in</w:t>
+      </w:r>
+      <w:r>
+        <w:t xml:space="preserve"> </w:t>
+      </w:r>
+      <m:oMath>
+        <m:r>
+          <m:t>h</m:t>
+        </m:r>
+      </m:oMath>
+      <w:r>
+        <w:t xml:space="preserve"> </w:t>
+      </w:r>
+      <w:r>
+        <w:t xml:space="preserve">fits RoPE’s setting medians with</w:t>
+      </w:r>
+      <w:r>
+        <w:t xml:space="preserve"> </w:t>
+      </w:r>
+      <m:oMath>
+        <m:sSup>
+          <m:e>
+            <m:r>
+              <m:t>R</m:t>
+            </m:r>
+          </m:e>
+          <m:sup>
+            <m:r>
+              <m:t>2</m:t>
+            </m:r>
+          </m:sup>
+        </m:sSup>
+        <m:r>
+          <m:rPr>
+            <m:sty m:val="p"/>
+          </m:rPr>
+          <m:t>=</m:t>
+        </m:r>
+        <m:r>
+          <m:t>0.68</m:t>
+        </m:r>
+      </m:oMath>
+      <w:r>
+        <w:t xml:space="preserve"> </w:t>
+      </w:r>
+      <w:r>
+        <w:t xml:space="preserve">(criterion</w:t>
+      </w:r>
+      <w:r>
+        <w:t xml:space="preserve"> </w:t>
+      </w:r>
+      <m:oMath>
+        <m:r>
+          <m:rPr>
+            <m:sty m:val="p"/>
+          </m:rPr>
+          <m:t>≥</m:t>
+        </m:r>
+        <m:r>
+          <m:t>0.8</m:t>
+        </m:r>
+      </m:oMath>
+      <w:r>
+        <w:t xml:space="preserve">). Post hoc, this traces to one unidentifiable fit (one seed at</w:t>
+      </w:r>
+      <w:r>
+        <w:t xml:space="preserve"> </w:t>
+      </w:r>
+      <m:oMath>
+        <m:r>
+          <m:rPr>
+            <m:sty m:val="p"/>
+          </m:rPr>
+          <m:t>(</m:t>
+        </m:r>
+        <m:r>
+          <m:t>0.003</m:t>
+        </m:r>
+        <m:r>
+          <m:rPr>
+            <m:sty m:val="p"/>
+          </m:rPr>
+          <m:t>,</m:t>
+        </m:r>
+        <m:r>
+          <m:t>0.3</m:t>
+        </m:r>
+        <m:r>
+          <m:rPr>
+            <m:sty m:val="p"/>
+          </m:rPr>
+          <m:t>)</m:t>
+        </m:r>
+      </m:oMath>
+      <w:r>
+        <w:t xml:space="preserve">;</w:t>
+      </w:r>
+      <w:r>
+        <w:t xml:space="preserve"> </w:t>
+      </w:r>
+      <m:oMath>
+        <m:sSup>
+          <m:e>
+            <m:r>
+              <m:t>h</m:t>
+            </m:r>
+          </m:e>
+          <m:sup>
+            <m:r>
+              <m:rPr>
+                <m:sty m:val="p"/>
+              </m:rPr>
+              <m:t>′</m:t>
+            </m:r>
+          </m:sup>
+        </m:sSup>
+        <m:r>
+          <m:rPr>
+            <m:sty m:val="p"/>
+          </m:rPr>
+          <m:t>≈</m:t>
+        </m:r>
+        <m:r>
+          <m:t>0</m:t>
+        </m:r>
+      </m:oMath>
+      <w:r>
+        <w:t xml:space="preserve"> </w:t>
+      </w:r>
+      <w:r>
+        <w:t xml:space="preserve">with scale 128). Without it,</w:t>
+      </w:r>
+      <w:r>
+        <w:t xml:space="preserve"> </w:t>
+      </w:r>
+      <m:oMath>
+        <m:sSup>
+          <m:e>
+            <m:r>
+              <m:t>h</m:t>
+            </m:r>
+          </m:e>
+          <m:sup>
+            <m:r>
+              <m:rPr>
+                <m:sty m:val="p"/>
+              </m:rPr>
+              <m:t>′</m:t>
+            </m:r>
+          </m:sup>
+        </m:sSup>
+        <m:r>
+          <m:rPr>
+            <m:sty m:val="p"/>
+          </m:rPr>
+          <m:t>=</m:t>
+        </m:r>
+        <m:r>
+          <m:t>1.26</m:t>
+        </m:r>
+        <m:r>
+          <m:t> </m:t>
+        </m:r>
+        <m:sSup>
+          <m:e>
+            <m:r>
+              <m:t>h</m:t>
+            </m:r>
+          </m:e>
+          <m:sup>
+            <m:r>
+              <m:t>0.88</m:t>
+            </m:r>
+          </m:sup>
+        </m:sSup>
+      </m:oMath>
+      <w:r>
+        <w:t xml:space="preserve"> </w:t>
+      </w:r>
+      <w:r>
+        <w:t xml:space="preserve">with</w:t>
+      </w:r>
+      <w:r>
+        <w:t xml:space="preserve"> </w:t>
+      </w:r>
+      <m:oMath>
+        <m:sSup>
+          <m:e>
+            <m:r>
+              <m:t>R</m:t>
+            </m:r>
+          </m:e>
+          <m:sup>
+            <m:r>
+              <m:t>2</m:t>
+            </m:r>
+          </m:sup>
+        </m:sSup>
+        <m:r>
+          <m:rPr>
+            <m:sty m:val="p"/>
+          </m:rPr>
+          <m:t>=</m:t>
+        </m:r>
+        <m:r>
+          <m:t>0.89</m:t>
+        </m:r>
+      </m:oMath>
+      <w:r>
+        <w:t xml:space="preserve">. The ALiBi constants do not transfer to RoPE (median</w:t>
+      </w:r>
+      <w:r>
+        <w:t xml:space="preserve"> </w:t>
+      </w:r>
+      <m:oMath>
+        <m:sSup>
+          <m:e>
+            <m:r>
+              <m:t>R</m:t>
+            </m:r>
+          </m:e>
+          <m:sup>
+            <m:r>
+              <m:t>2</m:t>
+            </m:r>
+          </m:sup>
+        </m:sSup>
+        <m:r>
+          <m:rPr>
+            <m:sty m:val="p"/>
+          </m:rPr>
+          <m:t>=</m:t>
+        </m:r>
+        <m:r>
+          <m:t>0.73</m:t>
+        </m:r>
+      </m:oMath>
+      <w:r>
+        <w:t xml:space="preserve">).</w:t>
+      </w:r>
+    </w:p>
+    <w:bookmarkEnd w:id="53"/>
+    <w:bookmarkStart w:id="54" w:name="robustness."/>
+    <w:p>
+      <w:pPr>
+        <w:pStyle w:val="Heading4"/>
+      </w:pPr>
+      <w:r>
+        <w:t xml:space="preserve">Robustness.</w:t>
+      </w:r>
+    </w:p>
+    <w:p>
+      <w:pPr>
+        <w:pStyle w:val="FirstParagraph"/>
+      </w:pPr>
+      <w:r>
+        <w:t xml:space="preserve">The qualitative pattern holds for every variation tested: retraining with the same seed reproduces</w:t>
+      </w:r>
+      <w:r>
+        <w:t xml:space="preserve"> </w:t>
+      </w:r>
+      <m:oMath>
+        <m:sSup>
+          <m:e>
+            <m:r>
+              <m:t>h</m:t>
+            </m:r>
+          </m:e>
+          <m:sup>
+            <m:r>
+              <m:rPr>
+                <m:sty m:val="p"/>
+              </m:rPr>
+              <m:t>′</m:t>
+            </m:r>
+          </m:sup>
+        </m:sSup>
+      </m:oMath>
+      <w:r>
+        <w:t xml:space="preserve"> </w:t>
+      </w:r>
+      <w:r>
+        <w:t xml:space="preserve">within 4% and</w:t>
+      </w:r>
+      <w:r>
+        <w:t xml:space="preserve"> </w:t>
+      </w:r>
+      <m:oMath>
+        <m:sSup>
+          <m:e>
+            <m:r>
+              <m:t>ε</m:t>
+            </m:r>
+          </m:e>
+          <m:sup>
+            <m:r>
+              <m:rPr>
+                <m:sty m:val="p"/>
+              </m:rPr>
+              <m:t>′</m:t>
+            </m:r>
+          </m:sup>
+        </m:sSup>
+      </m:oMath>
+      <w:r>
+        <w:t xml:space="preserve"> </w:t>
+      </w:r>
+      <w:r>
+        <w:t xml:space="preserve">within 2% (probe-surface correlation</w:t>
+      </w:r>
+      <w:r>
+        <w:t xml:space="preserve"> </w:t>
+      </w:r>
+      <m:oMath>
+        <m:r>
+          <m:rPr>
+            <m:sty m:val="p"/>
+          </m:rPr>
+          <m:t>≥</m:t>
+        </m:r>
+        <m:r>
+          <m:t>0.9998</m:t>
+        </m:r>
+      </m:oMath>
+      <w:r>
+        <w:t xml:space="preserve">); new seeds fall within the original range; learning rates</w:t>
+      </w:r>
+      <w:r>
+        <w:t xml:space="preserve"> </w:t>
+      </w:r>
+      <m:oMath>
+        <m:r>
+          <m:t>3</m:t>
+        </m:r>
+        <m:r>
+          <m:rPr>
+            <m:sty m:val="p"/>
+          </m:rPr>
+          <m:t>×</m:t>
+        </m:r>
+        <m:sSup>
+          <m:e>
+            <m:r>
+              <m:t>10</m:t>
+            </m:r>
+          </m:e>
+          <m:sup>
+            <m:r>
+              <m:rPr>
+                <m:sty m:val="p"/>
+              </m:rPr>
+              <m:t>−</m:t>
+            </m:r>
+            <m:r>
+              <m:t>4</m:t>
+            </m:r>
+          </m:sup>
+        </m:sSup>
+      </m:oMath>
+      <w:r>
+        <w:t xml:space="preserve"> </w:t>
+      </w:r>
+      <w:r>
+        <w:t xml:space="preserve">and</w:t>
+      </w:r>
+      <w:r>
+        <w:t xml:space="preserve"> </w:t>
+      </w:r>
+      <m:oMath>
+        <m:r>
+          <m:t>3</m:t>
+        </m:r>
+        <m:r>
+          <m:rPr>
+            <m:sty m:val="p"/>
+          </m:rPr>
+          <m:t>×</m:t>
+        </m:r>
+        <m:sSup>
+          <m:e>
+            <m:r>
+              <m:t>10</m:t>
+            </m:r>
+          </m:e>
+          <m:sup>
+            <m:r>
+              <m:rPr>
+                <m:sty m:val="p"/>
+              </m:rPr>
+              <m:t>−</m:t>
+            </m:r>
+            <m:r>
+              <m:t>3</m:t>
+            </m:r>
+          </m:sup>
+        </m:sSup>
+      </m:oMath>
+      <w:r>
+        <w:t xml:space="preserve"> </w:t>
+      </w:r>
+      <w:r>
+        <w:t xml:space="preserve">and batch 256 leave ALiBi models at</w:t>
+      </w:r>
+      <w:r>
+        <w:t xml:space="preserve"> </w:t>
+      </w:r>
+      <m:oMath>
+        <m:sSup>
+          <m:e>
+            <m:r>
+              <m:t>h</m:t>
+            </m:r>
+          </m:e>
+          <m:sup>
+            <m:r>
+              <m:rPr>
+                <m:sty m:val="p"/>
+              </m:rPr>
+              <m:t>′</m:t>
+            </m:r>
+          </m:sup>
+        </m:sSup>
+        <m:r>
+          <m:rPr>
+            <m:sty m:val="p"/>
+          </m:rPr>
+          <m:t>/</m:t>
+        </m:r>
+        <m:r>
+          <m:t>h</m:t>
+        </m:r>
+        <m:r>
+          <m:rPr>
+            <m:sty m:val="p"/>
+          </m:rPr>
+          <m:t>=</m:t>
+        </m:r>
+        <m:r>
+          <m:t>3.3</m:t>
+        </m:r>
+      </m:oMath>
+      <w:r>
+        <w:t xml:space="preserve">–</w:t>
+      </w:r>
+      <m:oMath>
+        <m:r>
+          <m:t>6.3</m:t>
+        </m:r>
+      </m:oMath>
+      <w:r>
+        <w:t xml:space="preserve">; three times longer training changes</w:t>
+      </w:r>
+      <w:r>
+        <w:t xml:space="preserve"> </w:t>
+      </w:r>
+      <m:oMath>
+        <m:sSup>
+          <m:e>
+            <m:r>
+              <m:t>h</m:t>
+            </m:r>
+          </m:e>
+          <m:sup>
+            <m:r>
+              <m:rPr>
+                <m:sty m:val="p"/>
+              </m:rPr>
+              <m:t>′</m:t>
+            </m:r>
+          </m:sup>
+        </m:sSup>
+      </m:oMath>
+      <w:r>
+        <w:t xml:space="preserve"> </w:t>
+      </w:r>
+      <w:r>
+        <w:t xml:space="preserve">by</w:t>
+      </w:r>
+      <w:r>
+        <w:t xml:space="preserve"> </w:t>
+      </w:r>
+      <m:oMath>
+        <m:r>
+          <m:rPr>
+            <m:sty m:val="p"/>
+          </m:rPr>
+          <m:t>×</m:t>
+        </m:r>
+        <m:r>
+          <m:t>0.76</m:t>
+        </m:r>
+      </m:oMath>
+      <w:r>
+        <w:t xml:space="preserve">–</w:t>
+      </w:r>
+      <m:oMath>
+        <m:r>
+          <m:t>1.17</m:t>
+        </m:r>
+      </m:oMath>
+      <w:r>
+        <w:t xml:space="preserve">. Width 256 brings</w:t>
+      </w:r>
+      <w:r>
+        <w:t xml:space="preserve"> </w:t>
+      </w:r>
+      <m:oMath>
+        <m:sSup>
+          <m:e>
+            <m:r>
+              <m:t>h</m:t>
+            </m:r>
+          </m:e>
+          <m:sup>
+            <m:r>
+              <m:rPr>
+                <m:sty m:val="p"/>
+              </m:rPr>
+              <m:t>′</m:t>
+            </m:r>
+          </m:sup>
+        </m:sSup>
+      </m:oMath>
+      <w:r>
+        <w:t xml:space="preserve"> </w:t>
+      </w:r>
+      <w:r>
+        <w:t xml:space="preserve">closer to</w:t>
+      </w:r>
+      <w:r>
+        <w:t xml:space="preserve"> </w:t>
+      </w:r>
+      <m:oMath>
+        <m:r>
+          <m:t>h</m:t>
+        </m:r>
+      </m:oMath>
+      <w:r>
+        <w:t xml:space="preserve">, much more for RoPE (</w:t>
+      </w:r>
+      <m:oMath>
+        <m:r>
+          <m:t>1.3</m:t>
+        </m:r>
+      </m:oMath>
+      <w:r>
+        <w:t xml:space="preserve">–</w:t>
+      </w:r>
+      <m:oMath>
+        <m:r>
+          <m:t>1.5</m:t>
+        </m:r>
+        <m:r>
+          <m:rPr>
+            <m:sty m:val="p"/>
+          </m:rPr>
+          <m:t>×</m:t>
+        </m:r>
+      </m:oMath>
+      <w:r>
+        <w:t xml:space="preserve">) than for ALiBi (</w:t>
+      </w:r>
+      <m:oMath>
+        <m:r>
+          <m:t>2.9</m:t>
+        </m:r>
+      </m:oMath>
+      <w:r>
+        <w:t xml:space="preserve">–</w:t>
+      </w:r>
+      <m:oMath>
+        <m:r>
+          <m:t>5.3</m:t>
+        </m:r>
+        <m:r>
+          <m:rPr>
+            <m:sty m:val="p"/>
+          </m:rPr>
+          <m:t>×</m:t>
+        </m:r>
+      </m:oMath>
+      <w:r>
+        <w:t xml:space="preserve">). Training with 20% of the loss on extra conflict sequences, whose answers are sampled from the Bayes predictive, roughly halves the excess abruptness of the switch but raises the excess loss on ordinary data two- to four-fold.</w:t>
+      </w:r>
+    </w:p>
+    <w:bookmarkEnd w:id="54"/>
+    <w:bookmarkEnd w:id="55"/>
+    <w:bookmarkStart w:id="60" w:name="sec:causal"/>
+    <w:p>
+      <w:pPr>
+        <w:pStyle w:val="Heading1"/>
+      </w:pPr>
+      <w:r>
+        <w:t xml:space="preserve">The fading rate sets the believed switch rate</w:t>
+      </w:r>
+    </w:p>
+    <w:bookmarkStart w:id="59" w:name="fig:slope"/>
+    <w:p>
+      <w:pPr>
+        <w:pStyle w:val="CaptionedFigure"/>
+      </w:pPr>
+      <w:r>
+        <w:drawing>
+          <wp:inline>
+            <wp:extent cx="5334000" cy="1909010"/>
+            <wp:effectExtent b="0" l="0" r="0" t="0"/>
+            <wp:docPr descr="" title="" id="57" name="Picture"/>
+            <a:graphic>
+              <a:graphicData uri="http://schemas.openxmlformats.org/drawingml/2006/picture">
+                <pic:pic>
+                  <pic:nvPicPr>
+                    <pic:cNvPr descr="figures/fig_slope.png" id="58" name="Picture"/>
+                    <pic:cNvPicPr>
+                      <a:picLocks noChangeArrowheads="1" noChangeAspect="1"/>
+                    </pic:cNvPicPr>
+                  </pic:nvPicPr>
+                  <pic:blipFill>
+                    <a:blip r:embed="rId56"/>
                     <a:stretch>
                       <a:fillRect/>
                     </a:stretch>
@@ -6042,7 +9745,7 @@
         <w:t xml:space="preserve">). Right: ordinary-data loss is minimised at the trained slopes.</w:t>
       </w:r>
     </w:p>
-    <w:bookmarkEnd w:id="49"/>
+    <w:bookmarkEnd w:id="59"/>
     <w:p>
       <w:pPr>
         <w:pStyle w:val="BodyText"/>
@@ -6412,7 +10115,7 @@
           <w:rPr>
             <w:rStyle w:val="Hyperlink"/>
           </w:rPr>
-          <w:t xml:space="preserve">5</w:t>
+          <w:t xml:space="preserve">6</w:t>
         </w:r>
       </w:hyperlink>
       <w:r>
@@ -6585,8 +10288,8 @@
         <w:t xml:space="preserve">at 4–14% of positions), so the miscalibration is not due to a lack of conflicts: for these heads, the fading rate that is best for ordinary prediction implies a too-high switch rate on conflict probes.</w:t>
       </w:r>
     </w:p>
-    <w:bookmarkEnd w:id="50"/>
-    <w:bookmarkStart w:id="56" w:name="sec:mechanism"/>
+    <w:bookmarkEnd w:id="60"/>
+    <w:bookmarkStart w:id="66" w:name="sec:mechanism"/>
     <w:p>
       <w:pPr>
         <w:pStyle w:val="Heading1"/>
@@ -6595,7 +10298,7 @@
         <w:t xml:space="preserve">Mechanism: what is and is not explained</w:t>
       </w:r>
     </w:p>
-    <w:bookmarkStart w:id="54" w:name="fig:mech"/>
+    <w:bookmarkStart w:id="64" w:name="fig:mech"/>
     <w:p>
       <w:pPr>
         <w:pStyle w:val="CaptionedFigure"/>
@@ -6605,18 +10308,18 @@
           <wp:inline>
             <wp:extent cx="5334000" cy="1524000"/>
             <wp:effectExtent b="0" l="0" r="0" t="0"/>
-            <wp:docPr descr="" title="" id="52" name="Picture"/>
+            <wp:docPr descr="" title="" id="62" name="Picture"/>
             <a:graphic>
               <a:graphicData uri="http://schemas.openxmlformats.org/drawingml/2006/picture">
                 <pic:pic>
                   <pic:nvPicPr>
-                    <pic:cNvPr descr="figures/mechanism.png" id="53" name="Picture"/>
+                    <pic:cNvPr descr="figures/mechanism.png" id="63" name="Picture"/>
                     <pic:cNvPicPr>
                       <a:picLocks noChangeArrowheads="1" noChangeAspect="1"/>
                     </pic:cNvPicPr>
                   </pic:nvPicPr>
                   <pic:blipFill>
-                    <a:blip r:embed="rId51"/>
+                    <a:blip r:embed="rId61"/>
                     <a:stretch>
                       <a:fillRect/>
                     </a:stretch>
@@ -6737,7 +10440,7 @@
         <w:t xml:space="preserve">is linear in its attention to old minus recent copies. Right: the model’s decision predicted from measured attention.</w:t>
       </w:r>
     </w:p>
-    <w:bookmarkEnd w:id="54"/>
+    <w:bookmarkEnd w:id="64"/>
     <w:p>
       <w:pPr>
         <w:pStyle w:val="BodyText"/>
@@ -7070,7 +10773,7 @@
           <w:rPr>
             <w:rStyle w:val="Hyperlink"/>
           </w:rPr>
-          <w:t xml:space="preserve">6</w:t>
+          <w:t xml:space="preserve">7</w:t>
         </w:r>
       </w:hyperlink>
       <w:r>
@@ -7124,7 +10827,7 @@
         <w:t xml:space="preserve">0.75 vs 0.53 for ALiBi, 0.84 vs 0.58 for RoPE), while fast heads are counters.</w:t>
       </w:r>
     </w:p>
-    <w:bookmarkStart w:id="55" w:name="failed-mechanistic-predictions."/>
+    <w:bookmarkStart w:id="65" w:name="failed-mechanistic-predictions."/>
     <w:p>
       <w:pPr>
         <w:pStyle w:val="Heading4"/>
@@ -7245,9 +10948,9 @@
         <w:t xml:space="preserve">(no). How the copy heads’ query–key product produces a Bayes-shaped split from the previous-token match, distance and token identity remains open.</w:t>
       </w:r>
     </w:p>
-    <w:bookmarkEnd w:id="55"/>
-    <w:bookmarkEnd w:id="56"/>
-    <w:bookmarkStart w:id="60" w:name="related-work"/>
+    <w:bookmarkEnd w:id="65"/>
+    <w:bookmarkEnd w:id="66"/>
+    <w:bookmarkStart w:id="70" w:name="related-work"/>
     <w:p>
       <w:pPr>
         <w:pStyle w:val="Heading1"/>
@@ -7256,7 +10959,7 @@
         <w:t xml:space="preserve">Related work</w:t>
       </w:r>
     </w:p>
-    <w:bookmarkStart w:id="57" w:name="induction-heads-and-markov-data."/>
+    <w:bookmarkStart w:id="67" w:name="induction-heads-and-markov-data."/>
     <w:p>
       <w:pPr>
         <w:pStyle w:val="Heading4"/>
@@ -7380,8 +11083,8 @@
         <w:t xml:space="preserve">that selective induction heads choose the causal lag in context. These works study stationary sources; we add non-stationarity (switches) in conflict with corruption (typos) and ask which of two optimal-in-their-regime rules is implemented.</w:t>
       </w:r>
     </w:p>
-    <w:bookmarkEnd w:id="57"/>
-    <w:bookmarkStart w:id="58" w:name="non-stationarity-and-recency."/>
+    <w:bookmarkEnd w:id="67"/>
+    <w:bookmarkStart w:id="68" w:name="non-stationarity-and-recency."/>
     <w:p>
       <w:pPr>
         <w:pStyle w:val="Heading4"/>
@@ -7455,8 +11158,8 @@
         <w:t xml:space="preserve">gives the optimal alternative.</w:t>
       </w:r>
     </w:p>
-    <w:bookmarkEnd w:id="58"/>
-    <w:bookmarkStart w:id="59" w:name="conflicting-evidence-in-llms."/>
+    <w:bookmarkEnd w:id="68"/>
+    <w:bookmarkStart w:id="69" w:name="conflicting-evidence-in-llms."/>
     <w:p>
       <w:pPr>
         <w:pStyle w:val="Heading4"/>
@@ -7503,9 +11206,9 @@
         <w:t xml:space="preserve">. Our setting isolates the recency–frequency trade-off behind such behaviour.</w:t>
       </w:r>
     </w:p>
-    <w:bookmarkEnd w:id="59"/>
-    <w:bookmarkEnd w:id="60"/>
-    <w:bookmarkStart w:id="61" w:name="limitations"/>
+    <w:bookmarkEnd w:id="69"/>
+    <w:bookmarkEnd w:id="70"/>
+    <w:bookmarkStart w:id="71" w:name="limitations"/>
     <w:p>
       <w:pPr>
         <w:pStyle w:val="Heading1"/>
@@ -7519,33 +11222,7 @@
         <w:pStyle w:val="FirstParagraph"/>
       </w:pPr>
       <w:r>
-        <w:t xml:space="preserve">All results are for one synthetic task family (16 keys, 64 values, 256-pair contexts, structured</w:t>
-      </w:r>
-      <w:r>
-        <w:t xml:space="preserve"> </w:t>
-      </w:r>
-      <w:r>
-        <w:t xml:space="preserve">“</w:t>
-      </w:r>
-      <m:oMath>
-        <m:r>
-          <m:rPr>
-            <m:sty m:val="p"/>
-          </m:rPr>
-          <m:t>+</m:t>
-        </m:r>
-        <m:r>
-          <m:t>1</m:t>
-        </m:r>
-      </m:oMath>
-      <w:r>
-        <w:t xml:space="preserve">”</w:t>
-      </w:r>
-      <w:r>
-        <w:t xml:space="preserve"> </w:t>
-      </w:r>
-      <w:r>
-        <w:t xml:space="preserve">typos) and small models (2–3 layers, width</w:t>
+        <w:t xml:space="preserve">All results are for one synthetic task family and small models (2–3 layers, width</w:t>
       </w:r>
       <w:r>
         <w:t xml:space="preserve"> </w:t>
@@ -7562,7 +11239,7 @@
         </m:r>
       </m:oMath>
       <w:r>
-        <w:t xml:space="preserve">). The constants in Eq. </w:t>
+        <w:t xml:space="preserve">). Within that family the laws were tested on new switch and typo rates, context lengths of 192–512 pairs, 32–128 values and 8–32 keys. The Bayes-like description itself requires structured typos: with uniformly random typos a discounted counter fits better. The laws have not been tested on much longer contexts, larger models or pretrained language models. The constants in Eq. </w:t>
       </w:r>
       <w:hyperlink w:anchor="eq:laws">
         <w:r>
@@ -7576,7 +11253,18 @@
         <w:t xml:space="preserve"> </w:t>
       </w:r>
       <w:r>
-        <w:t xml:space="preserve">are specific to 2-layer ALiBi models of width 128; RoPE models are closer to calibrated, and we have not varied context length, vocabulary or key frequencies, any of which may change them (switch timescales longer than the context are a natural suspect for the exponent below 1). Losses had not fully converged in 21 of 131 runs (median remaining improvement 0.0014 nats), although behaviour was unchanged under three times longer training.</w:t>
+        <w:t xml:space="preserve">are specific to ALiBi; RoPE models have their own, closer-to-calibrated constants. The laws do not include a model of the output scale</w:t>
+      </w:r>
+      <w:r>
+        <w:t xml:space="preserve"> </w:t>
+      </w:r>
+      <m:oMath>
+        <m:r>
+          <m:t>b</m:t>
+        </m:r>
+      </m:oMath>
+      <w:r>
+        <w:t xml:space="preserve">, which is what fails at the edges of the tested range, and</w:t>
       </w:r>
       <w:r>
         <w:t xml:space="preserve"> </w:t>
@@ -7585,7 +11273,7 @@
         <m:sSup>
           <m:e>
             <m:r>
-              <m:t>h</m:t>
+              <m:t>ε</m:t>
             </m:r>
           </m:e>
           <m:sup>
@@ -7602,11 +11290,48 @@
         <w:t xml:space="preserve"> </w:t>
       </w:r>
       <w:r>
-        <w:t xml:space="preserve">is weakly identified when the switch-over lies outside the probed gaps. The mechanism explains where the decision is made and what sets the miscalibration, not how the attention split becomes Bayes-shaped. We have not tested pretrained language models.</w:t>
+        <w:t xml:space="preserve">also depends on</w:t>
+      </w:r>
+      <w:r>
+        <w:t xml:space="preserve"> </w:t>
+      </w:r>
+      <m:oMath>
+        <m:r>
+          <m:t>h</m:t>
+        </m:r>
+      </m:oMath>
+      <w:r>
+        <w:t xml:space="preserve">. We do not know what makes ALiBi heads overestimate the switch rate; our pre-registered guess, a context shorter than the switch timescale, was refuted. Losses had not fully converged in 21 of 131 runs (median remaining improvement 0.0014 nats), although behaviour was unchanged under three times longer training.</w:t>
+      </w:r>
+      <w:r>
+        <w:t xml:space="preserve"> </w:t>
+      </w:r>
+      <m:oMath>
+        <m:sSup>
+          <m:e>
+            <m:r>
+              <m:t>h</m:t>
+            </m:r>
+          </m:e>
+          <m:sup>
+            <m:r>
+              <m:rPr>
+                <m:sty m:val="p"/>
+              </m:rPr>
+              <m:t>′</m:t>
+            </m:r>
+          </m:sup>
+        </m:sSup>
+      </m:oMath>
+      <w:r>
+        <w:t xml:space="preserve"> </w:t>
+      </w:r>
+      <w:r>
+        <w:t xml:space="preserve">is weakly identified when the switch-over lies outside the probed gaps (one RoPE fit is degenerate for this reason). The mechanism explains where the decision is made and what sets the miscalibration, not how the attention split becomes Bayes-shaped. Some run-6 cells have a single seed.</w:t>
       </w:r>
     </w:p>
-    <w:bookmarkEnd w:id="61"/>
-    <w:bookmarkStart w:id="62" w:name="conclusion"/>
+    <w:bookmarkEnd w:id="71"/>
+    <w:bookmarkStart w:id="72" w:name="conclusion"/>
     <w:p>
       <w:pPr>
         <w:pStyle w:val="Heading1"/>
@@ -7623,8 +11348,8 @@
         <w:t xml:space="preserve">In a task where recency and frequency are each optimal in a different regime, small transformers implement neither a pure counter nor the exact Bayes rule, but the Bayes rule at systematically wrong parameters. The miscalibration follows simple laws that predict held-out settings, is set causally by the copy heads’ fading rates, and is what ordinary-data loss prefers for those heads. This suggests a concrete lens on recency and repetition biases in larger models: as rational filters with miscalibrated beliefs about how often the world changes.</w:t>
       </w:r>
     </w:p>
-    <w:bookmarkEnd w:id="62"/>
-    <w:bookmarkStart w:id="63" w:name="derivation-of-proposition-propbayes"/>
+    <w:bookmarkEnd w:id="72"/>
+    <w:bookmarkStart w:id="73" w:name="derivation-of-proposition-propbayes"/>
     <w:p>
       <w:pPr>
         <w:pStyle w:val="Heading1"/>
@@ -8192,8 +11917,8 @@
         <w:t xml:space="preserve">.</w:t>
       </w:r>
     </w:p>
-    <w:bookmarkEnd w:id="63"/>
-    <w:bookmarkStart w:id="91" w:name="pre-registration-and-verification"/>
+    <w:bookmarkEnd w:id="73"/>
+    <w:bookmarkStart w:id="101" w:name="pre-registration-and-verification"/>
     <w:p>
       <w:pPr>
         <w:pStyle w:val="Heading1"/>
@@ -8239,8 +11964,8 @@
         <w:t xml:space="preserve">[TODO: link to code and the full audit]</w:t>
       </w:r>
     </w:p>
-    <w:bookmarkStart w:id="90" w:name="refs"/>
-    <w:bookmarkStart w:id="64" w:name="ref-adams2007bayesian"/>
+    <w:bookmarkStart w:id="100" w:name="refs"/>
+    <w:bookmarkStart w:id="74" w:name="ref-adams2007bayesian"/>
     <w:p>
       <w:pPr>
         <w:pStyle w:val="Bibliography"/>
@@ -8268,8 +11993,8 @@
         <w:t xml:space="preserve">.</w:t>
       </w:r>
     </w:p>
-    <w:bookmarkEnd w:id="64"/>
-    <w:bookmarkStart w:id="65" w:name="ref-bajaj2026temporal"/>
+    <w:bookmarkEnd w:id="74"/>
+    <w:bookmarkStart w:id="75" w:name="ref-bajaj2026temporal"/>
     <w:p>
       <w:pPr>
         <w:pStyle w:val="Bibliography"/>
@@ -8297,8 +12022,8 @@
         <w:t xml:space="preserve">.</w:t>
       </w:r>
     </w:p>
-    <w:bookmarkEnd w:id="65"/>
-    <w:bookmarkStart w:id="66" w:name="ref-bajaj2025beyond"/>
+    <w:bookmarkEnd w:id="75"/>
+    <w:bookmarkStart w:id="76" w:name="ref-bajaj2025beyond"/>
     <w:p>
       <w:pPr>
         <w:pStyle w:val="Bibliography"/>
@@ -8326,8 +12051,8 @@
         <w:t xml:space="preserve">.</w:t>
       </w:r>
     </w:p>
-    <w:bookmarkEnd w:id="66"/>
-    <w:bookmarkStart w:id="67" w:name="ref-bietti2023birth"/>
+    <w:bookmarkEnd w:id="76"/>
+    <w:bookmarkStart w:id="77" w:name="ref-bietti2023birth"/>
     <w:p>
       <w:pPr>
         <w:pStyle w:val="Bibliography"/>
@@ -8355,8 +12080,8 @@
         <w:t xml:space="preserve">.</w:t>
       </w:r>
     </w:p>
-    <w:bookmarkEnd w:id="67"/>
-    <w:bookmarkStart w:id="68" w:name="ref-crosbie2025induction"/>
+    <w:bookmarkEnd w:id="77"/>
+    <w:bookmarkStart w:id="78" w:name="ref-crosbie2025induction"/>
     <w:p>
       <w:pPr>
         <w:pStyle w:val="Bibliography"/>
@@ -8384,8 +12109,8 @@
         <w:t xml:space="preserve">.</w:t>
       </w:r>
     </w:p>
-    <w:bookmarkEnd w:id="68"/>
-    <w:bookmarkStart w:id="69" w:name="ref-dangelo2025selective"/>
+    <w:bookmarkEnd w:id="78"/>
+    <w:bookmarkStart w:id="79" w:name="ref-dangelo2025selective"/>
     <w:p>
       <w:pPr>
         <w:pStyle w:val="Bibliography"/>
@@ -8413,8 +12138,8 @@
         <w:t xml:space="preserve">.</w:t>
       </w:r>
     </w:p>
-    <w:bookmarkEnd w:id="69"/>
-    <w:bookmarkStart w:id="70" w:name="ref-dangelo2026induction"/>
+    <w:bookmarkEnd w:id="79"/>
+    <w:bookmarkStart w:id="80" w:name="ref-dangelo2026induction"/>
     <w:p>
       <w:pPr>
         <w:pStyle w:val="Bibliography"/>
@@ -8442,8 +12167,8 @@
         <w:t xml:space="preserve">.</w:t>
       </w:r>
     </w:p>
-    <w:bookmarkEnd w:id="70"/>
-    <w:bookmarkStart w:id="71" w:name="ref-dudley2026regime"/>
+    <w:bookmarkEnd w:id="80"/>
+    <w:bookmarkStart w:id="81" w:name="ref-dudley2026regime"/>
     <w:p>
       <w:pPr>
         <w:pStyle w:val="Bibliography"/>
@@ -8471,8 +12196,8 @@
         <w:t xml:space="preserve">.</w:t>
       </w:r>
     </w:p>
-    <w:bookmarkEnd w:id="71"/>
-    <w:bookmarkStart w:id="72" w:name="ref-edelman2024evolution"/>
+    <w:bookmarkEnd w:id="81"/>
+    <w:bookmarkStart w:id="82" w:name="ref-edelman2024evolution"/>
     <w:p>
       <w:pPr>
         <w:pStyle w:val="Bibliography"/>
@@ -8509,8 +12234,8 @@
         <w:t xml:space="preserve">.</w:t>
       </w:r>
     </w:p>
-    <w:bookmarkEnd w:id="72"/>
-    <w:bookmarkStart w:id="73" w:name="ref-ekbote2025whatone"/>
+    <w:bookmarkEnd w:id="82"/>
+    <w:bookmarkStart w:id="83" w:name="ref-ekbote2025whatone"/>
     <w:p>
       <w:pPr>
         <w:pStyle w:val="Bibliography"/>
@@ -8547,8 +12272,8 @@
         <w:t xml:space="preserve">.</w:t>
       </w:r>
     </w:p>
-    <w:bookmarkEnd w:id="73"/>
-    <w:bookmarkStart w:id="74" w:name="ref-elhage2021mathematical"/>
+    <w:bookmarkEnd w:id="83"/>
+    <w:bookmarkStart w:id="84" w:name="ref-elhage2021mathematical"/>
     <w:p>
       <w:pPr>
         <w:pStyle w:val="Bibliography"/>
@@ -8579,8 +12304,8 @@
         <w:t xml:space="preserve">.</w:t>
       </w:r>
     </w:p>
-    <w:bookmarkEnd w:id="74"/>
-    <w:bookmarkStart w:id="75" w:name="ref-hegazy2026recency"/>
+    <w:bookmarkEnd w:id="84"/>
+    <w:bookmarkStart w:id="85" w:name="ref-hegazy2026recency"/>
     <w:p>
       <w:pPr>
         <w:pStyle w:val="Bibliography"/>
@@ -8608,8 +12333,8 @@
         <w:t xml:space="preserve">.</w:t>
       </w:r>
     </w:p>
-    <w:bookmarkEnd w:id="75"/>
-    <w:bookmarkStart w:id="76" w:name="ref-kazemnejad2023impact"/>
+    <w:bookmarkEnd w:id="85"/>
+    <w:bookmarkStart w:id="86" w:name="ref-kazemnejad2023impact"/>
     <w:p>
       <w:pPr>
         <w:pStyle w:val="Bibliography"/>
@@ -8637,8 +12362,8 @@
         <w:t xml:space="preserve">.</w:t>
       </w:r>
     </w:p>
-    <w:bookmarkEnd w:id="76"/>
-    <w:bookmarkStart w:id="77" w:name="ref-kulhavy1993general"/>
+    <w:bookmarkEnd w:id="86"/>
+    <w:bookmarkStart w:id="87" w:name="ref-kulhavy1993general"/>
     <w:p>
       <w:pPr>
         <w:pStyle w:val="Bibliography"/>
@@ -8669,8 +12394,8 @@
         <w:t xml:space="preserve">58 (4).</w:t>
       </w:r>
     </w:p>
-    <w:bookmarkEnd w:id="77"/>
-    <w:bookmarkStart w:id="78" w:name="ref-makkuva2025attention"/>
+    <w:bookmarkEnd w:id="87"/>
+    <w:bookmarkStart w:id="88" w:name="ref-makkuva2025attention"/>
     <w:p>
       <w:pPr>
         <w:pStyle w:val="Bibliography"/>
@@ -8707,8 +12432,8 @@
         <w:t xml:space="preserve">.</w:t>
       </w:r>
     </w:p>
-    <w:bookmarkEnd w:id="78"/>
-    <w:bookmarkStart w:id="79" w:name="ref-mistry2025emergence"/>
+    <w:bookmarkEnd w:id="88"/>
+    <w:bookmarkStart w:id="89" w:name="ref-mistry2025emergence"/>
     <w:p>
       <w:pPr>
         <w:pStyle w:val="Bibliography"/>
@@ -8736,8 +12461,8 @@
         <w:t xml:space="preserve">.</w:t>
       </w:r>
     </w:p>
-    <w:bookmarkEnd w:id="79"/>
-    <w:bookmarkStart w:id="80" w:name="ref-naphade2026rational"/>
+    <w:bookmarkEnd w:id="89"/>
+    <w:bookmarkStart w:id="90" w:name="ref-naphade2026rational"/>
     <w:p>
       <w:pPr>
         <w:pStyle w:val="Bibliography"/>
@@ -8786,8 +12511,8 @@
         <w:t xml:space="preserve">.</w:t>
       </w:r>
     </w:p>
-    <w:bookmarkEnd w:id="80"/>
-    <w:bookmarkStart w:id="81" w:name="ref-nichani2024transformers"/>
+    <w:bookmarkEnd w:id="90"/>
+    <w:bookmarkStart w:id="91" w:name="ref-nichani2024transformers"/>
     <w:p>
       <w:pPr>
         <w:pStyle w:val="Bibliography"/>
@@ -8815,8 +12540,8 @@
         <w:t xml:space="preserve">.</w:t>
       </w:r>
     </w:p>
-    <w:bookmarkEnd w:id="81"/>
-    <w:bookmarkStart w:id="82" w:name="ref-olsson2022context"/>
+    <w:bookmarkEnd w:id="91"/>
+    <w:bookmarkStart w:id="92" w:name="ref-olsson2022context"/>
     <w:p>
       <w:pPr>
         <w:pStyle w:val="Bibliography"/>
@@ -8847,8 +12572,8 @@
         <w:t xml:space="preserve">.</w:t>
       </w:r>
     </w:p>
-    <w:bookmarkEnd w:id="82"/>
-    <w:bookmarkStart w:id="83" w:name="ref-press2022alibi"/>
+    <w:bookmarkEnd w:id="92"/>
+    <w:bookmarkStart w:id="93" w:name="ref-press2022alibi"/>
     <w:p>
       <w:pPr>
         <w:pStyle w:val="Bibliography"/>
@@ -8876,8 +12601,8 @@
         <w:t xml:space="preserve">.</w:t>
       </w:r>
     </w:p>
-    <w:bookmarkEnd w:id="83"/>
-    <w:bookmarkStart w:id="84" w:name="ref-qiao2026diagnosing"/>
+    <w:bookmarkEnd w:id="93"/>
+    <w:bookmarkStart w:id="94" w:name="ref-qiao2026diagnosing"/>
     <w:p>
       <w:pPr>
         <w:pStyle w:val="Bibliography"/>
@@ -8905,8 +12630,8 @@
         <w:t xml:space="preserve">.</w:t>
       </w:r>
     </w:p>
-    <w:bookmarkEnd w:id="84"/>
-    <w:bookmarkStart w:id="85" w:name="ref-qin2026learning"/>
+    <w:bookmarkEnd w:id="94"/>
+    <w:bookmarkStart w:id="95" w:name="ref-qin2026learning"/>
     <w:p>
       <w:pPr>
         <w:pStyle w:val="Bibliography"/>
@@ -8934,8 +12659,8 @@
         <w:t xml:space="preserve">.</w:t>
       </w:r>
     </w:p>
-    <w:bookmarkEnd w:id="85"/>
-    <w:bookmarkStart w:id="86" w:name="ref-rajaraman2024transformers"/>
+    <w:bookmarkEnd w:id="95"/>
+    <w:bookmarkStart w:id="96" w:name="ref-rajaraman2024transformers"/>
     <w:p>
       <w:pPr>
         <w:pStyle w:val="Bibliography"/>
@@ -8972,8 +12697,8 @@
         <w:t xml:space="preserve">.</w:t>
       </w:r>
     </w:p>
-    <w:bookmarkEnd w:id="86"/>
-    <w:bookmarkStart w:id="87" w:name="ref-su2024roformer"/>
+    <w:bookmarkEnd w:id="96"/>
+    <w:bookmarkStart w:id="97" w:name="ref-su2024roformer"/>
     <w:p>
       <w:pPr>
         <w:pStyle w:val="Bibliography"/>
@@ -9010,8 +12735,8 @@
         <w:t xml:space="preserve">568.</w:t>
       </w:r>
     </w:p>
-    <w:bookmarkEnd w:id="87"/>
-    <w:bookmarkStart w:id="88" w:name="ref-wu2025emergence"/>
+    <w:bookmarkEnd w:id="97"/>
+    <w:bookmarkStart w:id="98" w:name="ref-wu2025emergence"/>
     <w:p>
       <w:pPr>
         <w:pStyle w:val="Bibliography"/>
@@ -9039,8 +12764,8 @@
         <w:t xml:space="preserve">.</w:t>
       </w:r>
     </w:p>
-    <w:bookmarkEnd w:id="88"/>
-    <w:bookmarkStart w:id="89" w:name="ref-zhou2026information"/>
+    <w:bookmarkEnd w:id="98"/>
+    <w:bookmarkStart w:id="99" w:name="ref-zhou2026information"/>
     <w:p>
       <w:pPr>
         <w:pStyle w:val="Bibliography"/>
@@ -9077,9 +12802,9 @@
         <w:t xml:space="preserve">.</w:t>
       </w:r>
     </w:p>
-    <w:bookmarkEnd w:id="89"/>
-    <w:bookmarkEnd w:id="90"/>
-    <w:bookmarkEnd w:id="91"/>
+    <w:bookmarkEnd w:id="99"/>
+    <w:bookmarkEnd w:id="100"/>
+    <w:bookmarkEnd w:id="101"/>
     <w:sectPr>
       <w:footnotePr>
         <w:numRestart w:val="eachSect"/>
@@ -9297,6 +13022,12 @@
     <w:abstractNumId w:val="990"/>
   </w:num>
   <w:num w:numId="1001">
+    <w:abstractNumId w:val="991"/>
+  </w:num>
+  <w:num w:numId="1002">
+    <w:abstractNumId w:val="991"/>
+  </w:num>
+  <w:num w:numId="1003">
     <w:abstractNumId w:val="991"/>
   </w:num>
 </w:numbering>

</xml_diff>